<commit_message>
Describe your updates here--2
</commit_message>
<xml_diff>
--- a/classwork/Doc1.docx
+++ b/classwork/Doc1.docx
@@ -2875,6 +2875,14 @@
       </w:tblGrid>
       <w:tr>
         <w:tblPrEx>
+          <w:tblBorders>
+            <w:top w:val="single" w:color="auto" w:sz="4" w:space="0"/>
+            <w:left w:val="single" w:color="auto" w:sz="4" w:space="0"/>
+            <w:bottom w:val="single" w:color="auto" w:sz="4" w:space="0"/>
+            <w:right w:val="single" w:color="auto" w:sz="4" w:space="0"/>
+            <w:insideH w:val="single" w:color="auto" w:sz="4" w:space="0"/>
+            <w:insideV w:val="single" w:color="auto" w:sz="4" w:space="0"/>
+          </w:tblBorders>
           <w:tblCellMar>
             <w:top w:w="0" w:type="dxa"/>
             <w:left w:w="108" w:type="dxa"/>
@@ -4142,6 +4150,7 @@
       <w:pPr>
         <w:pStyle w:val="29"/>
         <w:numPr>
+          <w:ilvl w:val="0"/>
           <w:numId w:val="0"/>
         </w:numPr>
         <w:rPr>
@@ -4155,6 +4164,7 @@
       <w:pPr>
         <w:pStyle w:val="29"/>
         <w:numPr>
+          <w:ilvl w:val="0"/>
           <w:numId w:val="0"/>
         </w:numPr>
         <w:rPr>
@@ -4176,6 +4186,7 @@
       <w:pPr>
         <w:pStyle w:val="29"/>
         <w:numPr>
+          <w:ilvl w:val="0"/>
           <w:numId w:val="0"/>
         </w:numPr>
         <w:rPr>
@@ -4197,6 +4208,7 @@
       <w:pPr>
         <w:pStyle w:val="29"/>
         <w:numPr>
+          <w:ilvl w:val="0"/>
           <w:numId w:val="0"/>
         </w:numPr>
         <w:rPr>
@@ -4236,6 +4248,7 @@
       <w:pPr>
         <w:pStyle w:val="29"/>
         <w:numPr>
+          <w:ilvl w:val="0"/>
           <w:numId w:val="0"/>
         </w:numPr>
         <w:rPr>
@@ -4257,6 +4270,7 @@
       <w:pPr>
         <w:pStyle w:val="29"/>
         <w:numPr>
+          <w:ilvl w:val="0"/>
           <w:numId w:val="0"/>
         </w:numPr>
         <w:rPr>
@@ -4270,6 +4284,7 @@
       <w:pPr>
         <w:pStyle w:val="29"/>
         <w:numPr>
+          <w:ilvl w:val="0"/>
           <w:numId w:val="0"/>
         </w:numPr>
         <w:rPr>
@@ -4291,6 +4306,7 @@
       <w:pPr>
         <w:pStyle w:val="29"/>
         <w:numPr>
+          <w:ilvl w:val="0"/>
           <w:numId w:val="0"/>
         </w:numPr>
         <w:ind w:firstLine="720" w:firstLineChars="0"/>
@@ -4313,6 +4329,7 @@
       <w:pPr>
         <w:pStyle w:val="29"/>
         <w:numPr>
+          <w:ilvl w:val="0"/>
           <w:numId w:val="0"/>
         </w:numPr>
         <w:ind w:firstLine="720" w:firstLineChars="0"/>
@@ -4335,6 +4352,7 @@
       <w:pPr>
         <w:pStyle w:val="29"/>
         <w:numPr>
+          <w:ilvl w:val="0"/>
           <w:numId w:val="0"/>
         </w:numPr>
         <w:ind w:firstLine="720" w:firstLineChars="0"/>
@@ -4357,6 +4375,7 @@
       <w:pPr>
         <w:pStyle w:val="29"/>
         <w:numPr>
+          <w:ilvl w:val="0"/>
           <w:numId w:val="0"/>
         </w:numPr>
         <w:rPr>
@@ -4365,6 +4384,3012 @@
           <w:lang w:val="en-IN"/>
         </w:rPr>
       </w:pPr>
+    </w:p>
+    <w:p>
+      <w:pPr>
+        <w:pStyle w:val="29"/>
+        <w:numPr>
+          <w:ilvl w:val="0"/>
+          <w:numId w:val="0"/>
+        </w:numPr>
+        <w:rPr>
+          <w:rFonts w:hint="default"/>
+          <w:u w:val="none"/>
+          <w:lang w:val="en-IN"/>
+        </w:rPr>
+      </w:pPr>
+      <w:r>
+        <w:rPr>
+          <w:rFonts w:hint="default"/>
+          <w:u w:val="none"/>
+          <w:lang w:val="en-IN"/>
+        </w:rPr>
+        <w:t>Assignment : -examples of where exactly polymorphism used.</w:t>
+      </w:r>
+    </w:p>
+    <w:p>
+      <w:pPr>
+        <w:pStyle w:val="29"/>
+        <w:numPr>
+          <w:ilvl w:val="0"/>
+          <w:numId w:val="0"/>
+        </w:numPr>
+        <w:rPr>
+          <w:rFonts w:hint="default"/>
+          <w:u w:val="none"/>
+          <w:lang w:val="en-IN"/>
+        </w:rPr>
+      </w:pPr>
+      <w:r>
+        <w:rPr>
+          <w:rFonts w:hint="default"/>
+          <w:u w:val="none"/>
+          <w:lang w:val="en-IN"/>
+        </w:rPr>
+        <w:t>-Example program Method overloading and method overriding.</w:t>
+      </w:r>
+    </w:p>
+    <w:p>
+      <w:pPr>
+        <w:pStyle w:val="29"/>
+        <w:numPr>
+          <w:ilvl w:val="0"/>
+          <w:numId w:val="0"/>
+        </w:numPr>
+        <w:rPr>
+          <w:rFonts w:hint="default"/>
+          <w:u w:val="none"/>
+          <w:lang w:val="en-IN"/>
+        </w:rPr>
+      </w:pPr>
+    </w:p>
+    <w:p>
+      <w:pPr>
+        <w:pStyle w:val="29"/>
+        <w:numPr>
+          <w:ilvl w:val="0"/>
+          <w:numId w:val="0"/>
+        </w:numPr>
+        <w:rPr>
+          <w:rFonts w:hint="default"/>
+          <w:u w:val="none"/>
+          <w:lang w:val="en-IN"/>
+        </w:rPr>
+      </w:pPr>
+    </w:p>
+    <w:p>
+      <w:pPr>
+        <w:pStyle w:val="29"/>
+        <w:numPr>
+          <w:ilvl w:val="0"/>
+          <w:numId w:val="0"/>
+        </w:numPr>
+        <w:rPr>
+          <w:rFonts w:hint="default"/>
+          <w:u w:val="none"/>
+          <w:lang w:val="en-IN"/>
+        </w:rPr>
+      </w:pPr>
+    </w:p>
+    <w:p>
+      <w:pPr>
+        <w:pStyle w:val="29"/>
+        <w:numPr>
+          <w:ilvl w:val="0"/>
+          <w:numId w:val="0"/>
+        </w:numPr>
+        <w:rPr>
+          <w:rFonts w:hint="default"/>
+          <w:u w:val="none"/>
+          <w:lang w:val="en-IN"/>
+        </w:rPr>
+      </w:pPr>
+    </w:p>
+    <w:p>
+      <w:pPr>
+        <w:pStyle w:val="29"/>
+        <w:numPr>
+          <w:ilvl w:val="0"/>
+          <w:numId w:val="0"/>
+        </w:numPr>
+        <w:rPr>
+          <w:rFonts w:hint="default"/>
+          <w:u w:val="none"/>
+          <w:lang w:val="en-IN"/>
+        </w:rPr>
+      </w:pPr>
+    </w:p>
+    <w:p>
+      <w:pPr>
+        <w:pStyle w:val="29"/>
+        <w:numPr>
+          <w:ilvl w:val="0"/>
+          <w:numId w:val="0"/>
+        </w:numPr>
+        <w:rPr>
+          <w:rFonts w:hint="default"/>
+          <w:u w:val="none"/>
+          <w:lang w:val="en-IN"/>
+        </w:rPr>
+      </w:pPr>
+    </w:p>
+    <w:p>
+      <w:pPr>
+        <w:pStyle w:val="29"/>
+        <w:numPr>
+          <w:ilvl w:val="0"/>
+          <w:numId w:val="0"/>
+        </w:numPr>
+        <w:rPr>
+          <w:rFonts w:hint="default"/>
+          <w:u w:val="none"/>
+          <w:lang w:val="en-IN"/>
+        </w:rPr>
+      </w:pPr>
+    </w:p>
+    <w:p>
+      <w:pPr>
+        <w:pStyle w:val="29"/>
+        <w:numPr>
+          <w:ilvl w:val="0"/>
+          <w:numId w:val="0"/>
+        </w:numPr>
+        <w:rPr>
+          <w:rFonts w:hint="default"/>
+          <w:u w:val="none"/>
+          <w:lang w:val="en-IN"/>
+        </w:rPr>
+      </w:pPr>
+    </w:p>
+    <w:p>
+      <w:pPr>
+        <w:pStyle w:val="29"/>
+        <w:numPr>
+          <w:ilvl w:val="0"/>
+          <w:numId w:val="0"/>
+        </w:numPr>
+        <w:ind w:left="110" w:hanging="110" w:hangingChars="50"/>
+        <w:rPr>
+          <w:rFonts w:hint="default"/>
+          <w:u w:val="single"/>
+          <w:lang w:val="en-US"/>
+        </w:rPr>
+      </w:pPr>
+      <w:r>
+        <w:rPr>
+          <w:rFonts w:hint="default"/>
+          <w:u w:val="single"/>
+          <w:lang w:val="en-US"/>
+        </w:rPr>
+        <w:t>Problems with array:</w:t>
+      </w:r>
+    </w:p>
+    <w:p>
+      <w:pPr>
+        <w:pStyle w:val="29"/>
+        <w:numPr>
+          <w:ilvl w:val="0"/>
+          <w:numId w:val="0"/>
+        </w:numPr>
+        <w:ind w:left="110" w:hanging="110" w:hangingChars="50"/>
+        <w:rPr>
+          <w:rFonts w:hint="default"/>
+          <w:u w:val="none"/>
+          <w:lang w:val="en-US"/>
+        </w:rPr>
+      </w:pPr>
+      <w:r>
+        <w:rPr>
+          <w:rFonts w:hint="default"/>
+          <w:u w:val="none"/>
+          <w:lang w:val="en-US"/>
+        </w:rPr>
+        <w:t>-&gt; Arrays have only fixed size so we cannot add any extra elements or lose of space if less elements of same data types.</w:t>
+      </w:r>
+    </w:p>
+    <w:p>
+      <w:pPr>
+        <w:pStyle w:val="29"/>
+        <w:numPr>
+          <w:ilvl w:val="0"/>
+          <w:numId w:val="0"/>
+        </w:numPr>
+        <w:rPr>
+          <w:rFonts w:hint="default"/>
+          <w:u w:val="none"/>
+          <w:lang w:val="en-US"/>
+        </w:rPr>
+      </w:pPr>
+      <w:r>
+        <w:rPr>
+          <w:rFonts w:hint="default"/>
+          <w:u w:val="none"/>
+          <w:lang w:val="en-US"/>
+        </w:rPr>
+        <w:t xml:space="preserve">So solution = Collections </w:t>
+      </w:r>
+    </w:p>
+    <w:p>
+      <w:pPr>
+        <w:pStyle w:val="29"/>
+        <w:numPr>
+          <w:ilvl w:val="0"/>
+          <w:numId w:val="0"/>
+        </w:numPr>
+        <w:rPr>
+          <w:rFonts w:hint="default"/>
+          <w:u w:val="single"/>
+          <w:lang w:val="en-US"/>
+        </w:rPr>
+      </w:pPr>
+      <w:r>
+        <w:rPr>
+          <w:rFonts w:hint="default"/>
+          <w:u w:val="single"/>
+          <w:lang w:val="en-US"/>
+        </w:rPr>
+        <w:t>Collections: -</w:t>
+      </w:r>
+      <w:r>
+        <w:rPr>
+          <w:rFonts w:hint="default"/>
+          <w:u w:val="none"/>
+          <w:lang w:val="en-US"/>
+        </w:rPr>
+        <w:t xml:space="preserve"> Dynamic sizing:</w:t>
+      </w:r>
+    </w:p>
+    <w:p>
+      <w:pPr>
+        <w:pStyle w:val="29"/>
+        <w:numPr>
+          <w:ilvl w:val="0"/>
+          <w:numId w:val="0"/>
+        </w:numPr>
+        <w:rPr>
+          <w:rFonts w:hint="default"/>
+          <w:u w:val="none"/>
+          <w:lang w:val="en-US"/>
+        </w:rPr>
+      </w:pPr>
+      <w:r>
+        <w:rPr>
+          <w:rFonts w:hint="default"/>
+          <w:u w:val="none"/>
+          <w:lang w:val="en-US"/>
+        </w:rPr>
+        <w:t xml:space="preserve">ArrayList&lt;string&gt; course = new ArrayList&lt;&gt;(); ---------------&gt; wraper </w:t>
+      </w:r>
+    </w:p>
+    <w:p>
+      <w:pPr>
+        <w:pStyle w:val="29"/>
+        <w:numPr>
+          <w:ilvl w:val="0"/>
+          <w:numId w:val="0"/>
+        </w:numPr>
+        <w:rPr>
+          <w:rFonts w:hint="default"/>
+          <w:u w:val="none"/>
+          <w:lang w:val="en-US"/>
+        </w:rPr>
+      </w:pPr>
+      <w:r>
+        <w:rPr>
+          <w:rFonts w:hint="default"/>
+          <w:u w:val="none"/>
+          <w:lang w:val="en-US"/>
+        </w:rPr>
+        <w:t>course.size(); -----------------&gt;Fro length in list.</w:t>
+      </w:r>
+    </w:p>
+    <w:p>
+      <w:pPr>
+        <w:pStyle w:val="29"/>
+        <w:numPr>
+          <w:ilvl w:val="0"/>
+          <w:numId w:val="0"/>
+        </w:numPr>
+        <w:rPr>
+          <w:rFonts w:hint="default"/>
+          <w:u w:val="none"/>
+          <w:lang w:val="en-US"/>
+        </w:rPr>
+      </w:pPr>
+    </w:p>
+    <w:p>
+      <w:pPr>
+        <w:keepNext w:val="0"/>
+        <w:keepLines w:val="0"/>
+        <w:widowControl/>
+        <w:suppressLineNumbers w:val="0"/>
+        <w:shd w:val="clear" w:fill="121314"/>
+        <w:spacing w:line="228" w:lineRule="atLeast"/>
+        <w:jc w:val="left"/>
+        <w:rPr>
+          <w:rFonts w:ascii="Consolas" w:hAnsi="Consolas" w:eastAsia="Consolas" w:cs="Consolas"/>
+          <w:b w:val="0"/>
+          <w:bCs w:val="0"/>
+          <w:color w:val="BBBEBF"/>
+          <w:sz w:val="16"/>
+          <w:szCs w:val="16"/>
+        </w:rPr>
+      </w:pPr>
+      <w:r>
+        <w:rPr>
+          <w:rFonts w:hint="default" w:ascii="Consolas" w:hAnsi="Consolas" w:eastAsia="Consolas" w:cs="Consolas"/>
+          <w:b w:val="0"/>
+          <w:bCs w:val="0"/>
+          <w:color w:val="8B949E"/>
+          <w:kern w:val="0"/>
+          <w:sz w:val="16"/>
+          <w:szCs w:val="16"/>
+          <w:shd w:val="clear" w:fill="121314"/>
+          <w:lang w:val="en-US" w:eastAsia="zh-CN" w:bidi="ar"/>
+          <w14:ligatures w14:val="standardContextual"/>
+        </w:rPr>
+        <w:t>// Ecommerce application</w:t>
+      </w:r>
+    </w:p>
+    <w:p>
+      <w:pPr>
+        <w:keepNext w:val="0"/>
+        <w:keepLines w:val="0"/>
+        <w:widowControl/>
+        <w:suppressLineNumbers w:val="0"/>
+        <w:shd w:val="clear" w:fill="121314"/>
+        <w:spacing w:line="228" w:lineRule="atLeast"/>
+        <w:jc w:val="left"/>
+        <w:rPr>
+          <w:rFonts w:hint="default" w:ascii="Consolas" w:hAnsi="Consolas" w:eastAsia="Consolas" w:cs="Consolas"/>
+          <w:b w:val="0"/>
+          <w:bCs w:val="0"/>
+          <w:color w:val="BBBEBF"/>
+          <w:sz w:val="16"/>
+          <w:szCs w:val="16"/>
+        </w:rPr>
+      </w:pPr>
+      <w:r>
+        <w:rPr>
+          <w:rFonts w:hint="default" w:ascii="Consolas" w:hAnsi="Consolas" w:eastAsia="Consolas" w:cs="Consolas"/>
+          <w:b w:val="0"/>
+          <w:bCs w:val="0"/>
+          <w:color w:val="569CD6"/>
+          <w:kern w:val="0"/>
+          <w:sz w:val="16"/>
+          <w:szCs w:val="16"/>
+          <w:shd w:val="clear" w:fill="121314"/>
+          <w:lang w:val="en-US" w:eastAsia="zh-CN" w:bidi="ar"/>
+          <w14:ligatures w14:val="standardContextual"/>
+        </w:rPr>
+        <w:t>public</w:t>
+      </w:r>
+      <w:r>
+        <w:rPr>
+          <w:rFonts w:hint="default" w:ascii="Consolas" w:hAnsi="Consolas" w:eastAsia="Consolas" w:cs="Consolas"/>
+          <w:b w:val="0"/>
+          <w:bCs w:val="0"/>
+          <w:color w:val="BBBEBF"/>
+          <w:kern w:val="0"/>
+          <w:sz w:val="16"/>
+          <w:szCs w:val="16"/>
+          <w:shd w:val="clear" w:fill="121314"/>
+          <w:lang w:val="en-US" w:eastAsia="zh-CN" w:bidi="ar"/>
+          <w14:ligatures w14:val="standardContextual"/>
+        </w:rPr>
+        <w:t xml:space="preserve"> </w:t>
+      </w:r>
+      <w:r>
+        <w:rPr>
+          <w:rFonts w:hint="default" w:ascii="Consolas" w:hAnsi="Consolas" w:eastAsia="Consolas" w:cs="Consolas"/>
+          <w:b w:val="0"/>
+          <w:bCs w:val="0"/>
+          <w:color w:val="569CD6"/>
+          <w:kern w:val="0"/>
+          <w:sz w:val="16"/>
+          <w:szCs w:val="16"/>
+          <w:shd w:val="clear" w:fill="121314"/>
+          <w:lang w:val="en-US" w:eastAsia="zh-CN" w:bidi="ar"/>
+          <w14:ligatures w14:val="standardContextual"/>
+        </w:rPr>
+        <w:t>class</w:t>
+      </w:r>
+      <w:r>
+        <w:rPr>
+          <w:rFonts w:hint="default" w:ascii="Consolas" w:hAnsi="Consolas" w:eastAsia="Consolas" w:cs="Consolas"/>
+          <w:b w:val="0"/>
+          <w:bCs w:val="0"/>
+          <w:color w:val="BBBEBF"/>
+          <w:kern w:val="0"/>
+          <w:sz w:val="16"/>
+          <w:szCs w:val="16"/>
+          <w:shd w:val="clear" w:fill="121314"/>
+          <w:lang w:val="en-US" w:eastAsia="zh-CN" w:bidi="ar"/>
+          <w14:ligatures w14:val="standardContextual"/>
+        </w:rPr>
+        <w:t xml:space="preserve"> </w:t>
+      </w:r>
+      <w:r>
+        <w:rPr>
+          <w:rFonts w:hint="default" w:ascii="Consolas" w:hAnsi="Consolas" w:eastAsia="Consolas" w:cs="Consolas"/>
+          <w:b w:val="0"/>
+          <w:bCs w:val="0"/>
+          <w:color w:val="4EC9B0"/>
+          <w:kern w:val="0"/>
+          <w:sz w:val="16"/>
+          <w:szCs w:val="16"/>
+          <w:shd w:val="clear" w:fill="121314"/>
+          <w:lang w:val="en-US" w:eastAsia="zh-CN" w:bidi="ar"/>
+          <w14:ligatures w14:val="standardContextual"/>
+        </w:rPr>
+        <w:t>ShoppingCart</w:t>
+      </w:r>
+      <w:r>
+        <w:rPr>
+          <w:rFonts w:hint="default" w:ascii="Consolas" w:hAnsi="Consolas" w:eastAsia="Consolas" w:cs="Consolas"/>
+          <w:b w:val="0"/>
+          <w:bCs w:val="0"/>
+          <w:color w:val="BBBEBF"/>
+          <w:kern w:val="0"/>
+          <w:sz w:val="16"/>
+          <w:szCs w:val="16"/>
+          <w:shd w:val="clear" w:fill="121314"/>
+          <w:lang w:val="en-US" w:eastAsia="zh-CN" w:bidi="ar"/>
+          <w14:ligatures w14:val="standardContextual"/>
+        </w:rPr>
+        <w:t>{</w:t>
+      </w:r>
+    </w:p>
+    <w:p>
+      <w:pPr>
+        <w:keepNext w:val="0"/>
+        <w:keepLines w:val="0"/>
+        <w:widowControl/>
+        <w:suppressLineNumbers w:val="0"/>
+        <w:shd w:val="clear" w:fill="121314"/>
+        <w:spacing w:line="228" w:lineRule="atLeast"/>
+        <w:jc w:val="left"/>
+        <w:rPr>
+          <w:rFonts w:hint="default" w:ascii="Consolas" w:hAnsi="Consolas" w:eastAsia="Consolas" w:cs="Consolas"/>
+          <w:b w:val="0"/>
+          <w:bCs w:val="0"/>
+          <w:color w:val="BBBEBF"/>
+          <w:sz w:val="16"/>
+          <w:szCs w:val="16"/>
+        </w:rPr>
+      </w:pPr>
+      <w:r>
+        <w:rPr>
+          <w:rFonts w:hint="default" w:ascii="Consolas" w:hAnsi="Consolas" w:eastAsia="Consolas" w:cs="Consolas"/>
+          <w:b w:val="0"/>
+          <w:bCs w:val="0"/>
+          <w:color w:val="BBBEBF"/>
+          <w:kern w:val="0"/>
+          <w:sz w:val="16"/>
+          <w:szCs w:val="16"/>
+          <w:shd w:val="clear" w:fill="121314"/>
+          <w:lang w:val="en-US" w:eastAsia="zh-CN" w:bidi="ar"/>
+          <w14:ligatures w14:val="standardContextual"/>
+        </w:rPr>
+        <w:t xml:space="preserve">    </w:t>
+      </w:r>
+      <w:r>
+        <w:rPr>
+          <w:rFonts w:hint="default" w:ascii="Consolas" w:hAnsi="Consolas" w:eastAsia="Consolas" w:cs="Consolas"/>
+          <w:b w:val="0"/>
+          <w:bCs w:val="0"/>
+          <w:color w:val="569CD6"/>
+          <w:kern w:val="0"/>
+          <w:sz w:val="16"/>
+          <w:szCs w:val="16"/>
+          <w:shd w:val="clear" w:fill="121314"/>
+          <w:lang w:val="en-US" w:eastAsia="zh-CN" w:bidi="ar"/>
+          <w14:ligatures w14:val="standardContextual"/>
+        </w:rPr>
+        <w:t>private</w:t>
+      </w:r>
+      <w:r>
+        <w:rPr>
+          <w:rFonts w:hint="default" w:ascii="Consolas" w:hAnsi="Consolas" w:eastAsia="Consolas" w:cs="Consolas"/>
+          <w:b w:val="0"/>
+          <w:bCs w:val="0"/>
+          <w:color w:val="BBBEBF"/>
+          <w:kern w:val="0"/>
+          <w:sz w:val="16"/>
+          <w:szCs w:val="16"/>
+          <w:shd w:val="clear" w:fill="121314"/>
+          <w:lang w:val="en-US" w:eastAsia="zh-CN" w:bidi="ar"/>
+          <w14:ligatures w14:val="standardContextual"/>
+        </w:rPr>
+        <w:t xml:space="preserve"> </w:t>
+      </w:r>
+      <w:r>
+        <w:rPr>
+          <w:rFonts w:hint="default" w:ascii="Consolas" w:hAnsi="Consolas" w:eastAsia="Consolas" w:cs="Consolas"/>
+          <w:b w:val="0"/>
+          <w:bCs w:val="0"/>
+          <w:color w:val="4EC9B0"/>
+          <w:kern w:val="0"/>
+          <w:sz w:val="16"/>
+          <w:szCs w:val="16"/>
+          <w:shd w:val="clear" w:fill="121314"/>
+          <w:lang w:val="en-US" w:eastAsia="zh-CN" w:bidi="ar"/>
+          <w14:ligatures w14:val="standardContextual"/>
+        </w:rPr>
+        <w:t>Product</w:t>
+      </w:r>
+      <w:r>
+        <w:rPr>
+          <w:rFonts w:hint="default" w:ascii="Consolas" w:hAnsi="Consolas" w:eastAsia="Consolas" w:cs="Consolas"/>
+          <w:b w:val="0"/>
+          <w:bCs w:val="0"/>
+          <w:color w:val="FFA657"/>
+          <w:kern w:val="0"/>
+          <w:sz w:val="16"/>
+          <w:szCs w:val="16"/>
+          <w:shd w:val="clear" w:fill="121314"/>
+          <w:lang w:val="en-US" w:eastAsia="zh-CN" w:bidi="ar"/>
+          <w14:ligatures w14:val="standardContextual"/>
+        </w:rPr>
+        <w:t xml:space="preserve">[] </w:t>
+      </w:r>
+      <w:r>
+        <w:rPr>
+          <w:rFonts w:hint="default" w:ascii="Consolas" w:hAnsi="Consolas" w:eastAsia="Consolas" w:cs="Consolas"/>
+          <w:b w:val="0"/>
+          <w:bCs w:val="0"/>
+          <w:color w:val="C9D1D9"/>
+          <w:kern w:val="0"/>
+          <w:sz w:val="16"/>
+          <w:szCs w:val="16"/>
+          <w:shd w:val="clear" w:fill="121314"/>
+          <w:lang w:val="en-US" w:eastAsia="zh-CN" w:bidi="ar"/>
+          <w14:ligatures w14:val="standardContextual"/>
+        </w:rPr>
+        <w:t>items</w:t>
+      </w:r>
+      <w:r>
+        <w:rPr>
+          <w:rFonts w:hint="default" w:ascii="Consolas" w:hAnsi="Consolas" w:eastAsia="Consolas" w:cs="Consolas"/>
+          <w:b w:val="0"/>
+          <w:bCs w:val="0"/>
+          <w:color w:val="FFA657"/>
+          <w:kern w:val="0"/>
+          <w:sz w:val="16"/>
+          <w:szCs w:val="16"/>
+          <w:shd w:val="clear" w:fill="121314"/>
+          <w:lang w:val="en-US" w:eastAsia="zh-CN" w:bidi="ar"/>
+          <w14:ligatures w14:val="standardContextual"/>
+        </w:rPr>
+        <w:t xml:space="preserve"> </w:t>
+      </w:r>
+      <w:r>
+        <w:rPr>
+          <w:rFonts w:hint="default" w:ascii="Consolas" w:hAnsi="Consolas" w:eastAsia="Consolas" w:cs="Consolas"/>
+          <w:b w:val="0"/>
+          <w:bCs w:val="0"/>
+          <w:color w:val="D4D4D4"/>
+          <w:kern w:val="0"/>
+          <w:sz w:val="16"/>
+          <w:szCs w:val="16"/>
+          <w:shd w:val="clear" w:fill="121314"/>
+          <w:lang w:val="en-US" w:eastAsia="zh-CN" w:bidi="ar"/>
+          <w14:ligatures w14:val="standardContextual"/>
+        </w:rPr>
+        <w:t>=</w:t>
+      </w:r>
+      <w:r>
+        <w:rPr>
+          <w:rFonts w:hint="default" w:ascii="Consolas" w:hAnsi="Consolas" w:eastAsia="Consolas" w:cs="Consolas"/>
+          <w:b w:val="0"/>
+          <w:bCs w:val="0"/>
+          <w:color w:val="BBBEBF"/>
+          <w:kern w:val="0"/>
+          <w:sz w:val="16"/>
+          <w:szCs w:val="16"/>
+          <w:shd w:val="clear" w:fill="121314"/>
+          <w:lang w:val="en-US" w:eastAsia="zh-CN" w:bidi="ar"/>
+          <w14:ligatures w14:val="standardContextual"/>
+        </w:rPr>
+        <w:t xml:space="preserve"> </w:t>
+      </w:r>
+      <w:r>
+        <w:rPr>
+          <w:rFonts w:hint="default" w:ascii="Consolas" w:hAnsi="Consolas" w:eastAsia="Consolas" w:cs="Consolas"/>
+          <w:b w:val="0"/>
+          <w:bCs w:val="0"/>
+          <w:color w:val="C586C0"/>
+          <w:kern w:val="0"/>
+          <w:sz w:val="16"/>
+          <w:szCs w:val="16"/>
+          <w:shd w:val="clear" w:fill="121314"/>
+          <w:lang w:val="en-US" w:eastAsia="zh-CN" w:bidi="ar"/>
+          <w14:ligatures w14:val="standardContextual"/>
+        </w:rPr>
+        <w:t>new</w:t>
+      </w:r>
+      <w:r>
+        <w:rPr>
+          <w:rFonts w:hint="default" w:ascii="Consolas" w:hAnsi="Consolas" w:eastAsia="Consolas" w:cs="Consolas"/>
+          <w:b w:val="0"/>
+          <w:bCs w:val="0"/>
+          <w:color w:val="BBBEBF"/>
+          <w:kern w:val="0"/>
+          <w:sz w:val="16"/>
+          <w:szCs w:val="16"/>
+          <w:shd w:val="clear" w:fill="121314"/>
+          <w:lang w:val="en-US" w:eastAsia="zh-CN" w:bidi="ar"/>
+          <w14:ligatures w14:val="standardContextual"/>
+        </w:rPr>
+        <w:t xml:space="preserve"> </w:t>
+      </w:r>
+      <w:r>
+        <w:rPr>
+          <w:rFonts w:hint="default" w:ascii="Consolas" w:hAnsi="Consolas" w:eastAsia="Consolas" w:cs="Consolas"/>
+          <w:b w:val="0"/>
+          <w:bCs w:val="0"/>
+          <w:color w:val="4EC9B0"/>
+          <w:kern w:val="0"/>
+          <w:sz w:val="16"/>
+          <w:szCs w:val="16"/>
+          <w:shd w:val="clear" w:fill="121314"/>
+          <w:lang w:val="en-US" w:eastAsia="zh-CN" w:bidi="ar"/>
+          <w14:ligatures w14:val="standardContextual"/>
+        </w:rPr>
+        <w:t>Product</w:t>
+      </w:r>
+      <w:r>
+        <w:rPr>
+          <w:rFonts w:hint="default" w:ascii="Consolas" w:hAnsi="Consolas" w:eastAsia="Consolas" w:cs="Consolas"/>
+          <w:b w:val="0"/>
+          <w:bCs w:val="0"/>
+          <w:color w:val="BBBEBF"/>
+          <w:kern w:val="0"/>
+          <w:sz w:val="16"/>
+          <w:szCs w:val="16"/>
+          <w:shd w:val="clear" w:fill="121314"/>
+          <w:lang w:val="en-US" w:eastAsia="zh-CN" w:bidi="ar"/>
+          <w14:ligatures w14:val="standardContextual"/>
+        </w:rPr>
+        <w:t>[</w:t>
+      </w:r>
+      <w:r>
+        <w:rPr>
+          <w:rFonts w:hint="default" w:ascii="Consolas" w:hAnsi="Consolas" w:eastAsia="Consolas" w:cs="Consolas"/>
+          <w:b w:val="0"/>
+          <w:bCs w:val="0"/>
+          <w:color w:val="B5CEA8"/>
+          <w:kern w:val="0"/>
+          <w:sz w:val="16"/>
+          <w:szCs w:val="16"/>
+          <w:shd w:val="clear" w:fill="121314"/>
+          <w:lang w:val="en-US" w:eastAsia="zh-CN" w:bidi="ar"/>
+          <w14:ligatures w14:val="standardContextual"/>
+        </w:rPr>
+        <w:t>10</w:t>
+      </w:r>
+      <w:r>
+        <w:rPr>
+          <w:rFonts w:hint="default" w:ascii="Consolas" w:hAnsi="Consolas" w:eastAsia="Consolas" w:cs="Consolas"/>
+          <w:b w:val="0"/>
+          <w:bCs w:val="0"/>
+          <w:color w:val="BBBEBF"/>
+          <w:kern w:val="0"/>
+          <w:sz w:val="16"/>
+          <w:szCs w:val="16"/>
+          <w:shd w:val="clear" w:fill="121314"/>
+          <w:lang w:val="en-US" w:eastAsia="zh-CN" w:bidi="ar"/>
+          <w14:ligatures w14:val="standardContextual"/>
+        </w:rPr>
+        <w:t>];</w:t>
+      </w:r>
+    </w:p>
+    <w:p>
+      <w:pPr>
+        <w:keepNext w:val="0"/>
+        <w:keepLines w:val="0"/>
+        <w:widowControl/>
+        <w:suppressLineNumbers w:val="0"/>
+        <w:shd w:val="clear" w:fill="121314"/>
+        <w:spacing w:line="228" w:lineRule="atLeast"/>
+        <w:jc w:val="left"/>
+        <w:rPr>
+          <w:rFonts w:hint="default" w:ascii="Consolas" w:hAnsi="Consolas" w:eastAsia="Consolas" w:cs="Consolas"/>
+          <w:b w:val="0"/>
+          <w:bCs w:val="0"/>
+          <w:color w:val="BBBEBF"/>
+          <w:sz w:val="16"/>
+          <w:szCs w:val="16"/>
+        </w:rPr>
+      </w:pPr>
+    </w:p>
+    <w:p>
+      <w:pPr>
+        <w:keepNext w:val="0"/>
+        <w:keepLines w:val="0"/>
+        <w:widowControl/>
+        <w:suppressLineNumbers w:val="0"/>
+        <w:shd w:val="clear" w:fill="121314"/>
+        <w:spacing w:line="228" w:lineRule="atLeast"/>
+        <w:jc w:val="left"/>
+        <w:rPr>
+          <w:rFonts w:hint="default" w:ascii="Consolas" w:hAnsi="Consolas" w:eastAsia="Consolas" w:cs="Consolas"/>
+          <w:b w:val="0"/>
+          <w:bCs w:val="0"/>
+          <w:color w:val="BBBEBF"/>
+          <w:sz w:val="16"/>
+          <w:szCs w:val="16"/>
+        </w:rPr>
+      </w:pPr>
+      <w:r>
+        <w:rPr>
+          <w:rFonts w:hint="default" w:ascii="Consolas" w:hAnsi="Consolas" w:eastAsia="Consolas" w:cs="Consolas"/>
+          <w:b w:val="0"/>
+          <w:bCs w:val="0"/>
+          <w:color w:val="BBBEBF"/>
+          <w:kern w:val="0"/>
+          <w:sz w:val="16"/>
+          <w:szCs w:val="16"/>
+          <w:shd w:val="clear" w:fill="121314"/>
+          <w:lang w:val="en-US" w:eastAsia="zh-CN" w:bidi="ar"/>
+          <w14:ligatures w14:val="standardContextual"/>
+        </w:rPr>
+        <w:t xml:space="preserve">    </w:t>
+      </w:r>
+      <w:r>
+        <w:rPr>
+          <w:rFonts w:hint="default" w:ascii="Consolas" w:hAnsi="Consolas" w:eastAsia="Consolas" w:cs="Consolas"/>
+          <w:b w:val="0"/>
+          <w:bCs w:val="0"/>
+          <w:color w:val="569CD6"/>
+          <w:kern w:val="0"/>
+          <w:sz w:val="16"/>
+          <w:szCs w:val="16"/>
+          <w:shd w:val="clear" w:fill="121314"/>
+          <w:lang w:val="en-US" w:eastAsia="zh-CN" w:bidi="ar"/>
+          <w14:ligatures w14:val="standardContextual"/>
+        </w:rPr>
+        <w:t>private</w:t>
+      </w:r>
+      <w:r>
+        <w:rPr>
+          <w:rFonts w:hint="default" w:ascii="Consolas" w:hAnsi="Consolas" w:eastAsia="Consolas" w:cs="Consolas"/>
+          <w:b w:val="0"/>
+          <w:bCs w:val="0"/>
+          <w:color w:val="BBBEBF"/>
+          <w:kern w:val="0"/>
+          <w:sz w:val="16"/>
+          <w:szCs w:val="16"/>
+          <w:shd w:val="clear" w:fill="121314"/>
+          <w:lang w:val="en-US" w:eastAsia="zh-CN" w:bidi="ar"/>
+          <w14:ligatures w14:val="standardContextual"/>
+        </w:rPr>
+        <w:t xml:space="preserve"> </w:t>
+      </w:r>
+      <w:r>
+        <w:rPr>
+          <w:rFonts w:hint="default" w:ascii="Consolas" w:hAnsi="Consolas" w:eastAsia="Consolas" w:cs="Consolas"/>
+          <w:b w:val="0"/>
+          <w:bCs w:val="0"/>
+          <w:color w:val="4EC9B0"/>
+          <w:kern w:val="0"/>
+          <w:sz w:val="16"/>
+          <w:szCs w:val="16"/>
+          <w:shd w:val="clear" w:fill="121314"/>
+          <w:lang w:val="en-US" w:eastAsia="zh-CN" w:bidi="ar"/>
+          <w14:ligatures w14:val="standardContextual"/>
+        </w:rPr>
+        <w:t>List</w:t>
+      </w:r>
+      <w:r>
+        <w:rPr>
+          <w:rFonts w:hint="default" w:ascii="Consolas" w:hAnsi="Consolas" w:eastAsia="Consolas" w:cs="Consolas"/>
+          <w:b w:val="0"/>
+          <w:bCs w:val="0"/>
+          <w:color w:val="FFA657"/>
+          <w:kern w:val="0"/>
+          <w:sz w:val="16"/>
+          <w:szCs w:val="16"/>
+          <w:shd w:val="clear" w:fill="121314"/>
+          <w:lang w:val="en-US" w:eastAsia="zh-CN" w:bidi="ar"/>
+          <w14:ligatures w14:val="standardContextual"/>
+        </w:rPr>
+        <w:t>&lt;</w:t>
+      </w:r>
+      <w:r>
+        <w:rPr>
+          <w:rFonts w:hint="default" w:ascii="Consolas" w:hAnsi="Consolas" w:eastAsia="Consolas" w:cs="Consolas"/>
+          <w:b w:val="0"/>
+          <w:bCs w:val="0"/>
+          <w:color w:val="4EC9B0"/>
+          <w:kern w:val="0"/>
+          <w:sz w:val="16"/>
+          <w:szCs w:val="16"/>
+          <w:shd w:val="clear" w:fill="121314"/>
+          <w:lang w:val="en-US" w:eastAsia="zh-CN" w:bidi="ar"/>
+          <w14:ligatures w14:val="standardContextual"/>
+        </w:rPr>
+        <w:t>Product</w:t>
+      </w:r>
+      <w:r>
+        <w:rPr>
+          <w:rFonts w:hint="default" w:ascii="Consolas" w:hAnsi="Consolas" w:eastAsia="Consolas" w:cs="Consolas"/>
+          <w:b w:val="0"/>
+          <w:bCs w:val="0"/>
+          <w:color w:val="FFA657"/>
+          <w:kern w:val="0"/>
+          <w:sz w:val="16"/>
+          <w:szCs w:val="16"/>
+          <w:shd w:val="clear" w:fill="121314"/>
+          <w:lang w:val="en-US" w:eastAsia="zh-CN" w:bidi="ar"/>
+          <w14:ligatures w14:val="standardContextual"/>
+        </w:rPr>
+        <w:t xml:space="preserve">&gt; </w:t>
+      </w:r>
+      <w:r>
+        <w:rPr>
+          <w:rFonts w:hint="default" w:ascii="Consolas" w:hAnsi="Consolas" w:eastAsia="Consolas" w:cs="Consolas"/>
+          <w:b w:val="0"/>
+          <w:bCs w:val="0"/>
+          <w:color w:val="C9D1D9"/>
+          <w:kern w:val="0"/>
+          <w:sz w:val="16"/>
+          <w:szCs w:val="16"/>
+          <w:shd w:val="clear" w:fill="121314"/>
+          <w:lang w:val="en-US" w:eastAsia="zh-CN" w:bidi="ar"/>
+          <w14:ligatures w14:val="standardContextual"/>
+        </w:rPr>
+        <w:t>items</w:t>
+      </w:r>
+      <w:r>
+        <w:rPr>
+          <w:rFonts w:hint="default" w:ascii="Consolas" w:hAnsi="Consolas" w:eastAsia="Consolas" w:cs="Consolas"/>
+          <w:b w:val="0"/>
+          <w:bCs w:val="0"/>
+          <w:color w:val="FFA657"/>
+          <w:kern w:val="0"/>
+          <w:sz w:val="16"/>
+          <w:szCs w:val="16"/>
+          <w:shd w:val="clear" w:fill="121314"/>
+          <w:lang w:val="en-US" w:eastAsia="zh-CN" w:bidi="ar"/>
+          <w14:ligatures w14:val="standardContextual"/>
+        </w:rPr>
+        <w:t xml:space="preserve"> </w:t>
+      </w:r>
+      <w:r>
+        <w:rPr>
+          <w:rFonts w:hint="default" w:ascii="Consolas" w:hAnsi="Consolas" w:eastAsia="Consolas" w:cs="Consolas"/>
+          <w:b w:val="0"/>
+          <w:bCs w:val="0"/>
+          <w:color w:val="D4D4D4"/>
+          <w:kern w:val="0"/>
+          <w:sz w:val="16"/>
+          <w:szCs w:val="16"/>
+          <w:shd w:val="clear" w:fill="121314"/>
+          <w:lang w:val="en-US" w:eastAsia="zh-CN" w:bidi="ar"/>
+          <w14:ligatures w14:val="standardContextual"/>
+        </w:rPr>
+        <w:t>=</w:t>
+      </w:r>
+      <w:r>
+        <w:rPr>
+          <w:rFonts w:hint="default" w:ascii="Consolas" w:hAnsi="Consolas" w:eastAsia="Consolas" w:cs="Consolas"/>
+          <w:b w:val="0"/>
+          <w:bCs w:val="0"/>
+          <w:color w:val="BBBEBF"/>
+          <w:kern w:val="0"/>
+          <w:sz w:val="16"/>
+          <w:szCs w:val="16"/>
+          <w:shd w:val="clear" w:fill="121314"/>
+          <w:lang w:val="en-US" w:eastAsia="zh-CN" w:bidi="ar"/>
+          <w14:ligatures w14:val="standardContextual"/>
+        </w:rPr>
+        <w:t xml:space="preserve"> </w:t>
+      </w:r>
+      <w:r>
+        <w:rPr>
+          <w:rFonts w:hint="default" w:ascii="Consolas" w:hAnsi="Consolas" w:eastAsia="Consolas" w:cs="Consolas"/>
+          <w:b w:val="0"/>
+          <w:bCs w:val="0"/>
+          <w:color w:val="C586C0"/>
+          <w:kern w:val="0"/>
+          <w:sz w:val="16"/>
+          <w:szCs w:val="16"/>
+          <w:shd w:val="clear" w:fill="121314"/>
+          <w:lang w:val="en-US" w:eastAsia="zh-CN" w:bidi="ar"/>
+          <w14:ligatures w14:val="standardContextual"/>
+        </w:rPr>
+        <w:t>new</w:t>
+      </w:r>
+      <w:r>
+        <w:rPr>
+          <w:rFonts w:hint="default" w:ascii="Consolas" w:hAnsi="Consolas" w:eastAsia="Consolas" w:cs="Consolas"/>
+          <w:b w:val="0"/>
+          <w:bCs w:val="0"/>
+          <w:color w:val="BBBEBF"/>
+          <w:kern w:val="0"/>
+          <w:sz w:val="16"/>
+          <w:szCs w:val="16"/>
+          <w:shd w:val="clear" w:fill="121314"/>
+          <w:lang w:val="en-US" w:eastAsia="zh-CN" w:bidi="ar"/>
+          <w14:ligatures w14:val="standardContextual"/>
+        </w:rPr>
+        <w:t xml:space="preserve"> </w:t>
+      </w:r>
+      <w:r>
+        <w:rPr>
+          <w:rFonts w:hint="default" w:ascii="Consolas" w:hAnsi="Consolas" w:eastAsia="Consolas" w:cs="Consolas"/>
+          <w:b w:val="0"/>
+          <w:bCs w:val="0"/>
+          <w:color w:val="4EC9B0"/>
+          <w:kern w:val="0"/>
+          <w:sz w:val="16"/>
+          <w:szCs w:val="16"/>
+          <w:shd w:val="clear" w:fill="121314"/>
+          <w:lang w:val="en-US" w:eastAsia="zh-CN" w:bidi="ar"/>
+          <w14:ligatures w14:val="standardContextual"/>
+        </w:rPr>
+        <w:t>ArrayList</w:t>
+      </w:r>
+      <w:r>
+        <w:rPr>
+          <w:rFonts w:hint="default" w:ascii="Consolas" w:hAnsi="Consolas" w:eastAsia="Consolas" w:cs="Consolas"/>
+          <w:b w:val="0"/>
+          <w:bCs w:val="0"/>
+          <w:color w:val="BBBEBF"/>
+          <w:kern w:val="0"/>
+          <w:sz w:val="16"/>
+          <w:szCs w:val="16"/>
+          <w:shd w:val="clear" w:fill="121314"/>
+          <w:lang w:val="en-US" w:eastAsia="zh-CN" w:bidi="ar"/>
+          <w14:ligatures w14:val="standardContextual"/>
+        </w:rPr>
+        <w:t>&lt;&gt;();</w:t>
+      </w:r>
+    </w:p>
+    <w:p>
+      <w:pPr>
+        <w:keepNext w:val="0"/>
+        <w:keepLines w:val="0"/>
+        <w:widowControl/>
+        <w:suppressLineNumbers w:val="0"/>
+        <w:jc w:val="left"/>
+      </w:pPr>
+    </w:p>
+    <w:p>
+      <w:pPr>
+        <w:keepNext w:val="0"/>
+        <w:keepLines w:val="0"/>
+        <w:widowControl/>
+        <w:suppressLineNumbers w:val="0"/>
+        <w:shd w:val="clear" w:fill="121314"/>
+        <w:spacing w:line="228" w:lineRule="atLeast"/>
+        <w:jc w:val="left"/>
+        <w:rPr>
+          <w:rFonts w:hint="default" w:ascii="Consolas" w:hAnsi="Consolas" w:eastAsia="Consolas" w:cs="Consolas"/>
+          <w:b w:val="0"/>
+          <w:bCs w:val="0"/>
+          <w:color w:val="BBBEBF"/>
+          <w:sz w:val="16"/>
+          <w:szCs w:val="16"/>
+        </w:rPr>
+      </w:pPr>
+      <w:r>
+        <w:rPr>
+          <w:rFonts w:hint="default" w:ascii="Consolas" w:hAnsi="Consolas" w:eastAsia="Consolas" w:cs="Consolas"/>
+          <w:b w:val="0"/>
+          <w:bCs w:val="0"/>
+          <w:color w:val="BBBEBF"/>
+          <w:kern w:val="0"/>
+          <w:sz w:val="16"/>
+          <w:szCs w:val="16"/>
+          <w:shd w:val="clear" w:fill="121314"/>
+          <w:lang w:val="en-US" w:eastAsia="zh-CN" w:bidi="ar"/>
+          <w14:ligatures w14:val="standardContextual"/>
+        </w:rPr>
+        <w:t xml:space="preserve">    </w:t>
+      </w:r>
+      <w:r>
+        <w:rPr>
+          <w:rFonts w:hint="default" w:ascii="Consolas" w:hAnsi="Consolas" w:eastAsia="Consolas" w:cs="Consolas"/>
+          <w:b w:val="0"/>
+          <w:bCs w:val="0"/>
+          <w:color w:val="569CD6"/>
+          <w:kern w:val="0"/>
+          <w:sz w:val="16"/>
+          <w:szCs w:val="16"/>
+          <w:shd w:val="clear" w:fill="121314"/>
+          <w:lang w:val="en-US" w:eastAsia="zh-CN" w:bidi="ar"/>
+          <w14:ligatures w14:val="standardContextual"/>
+        </w:rPr>
+        <w:t>public</w:t>
+      </w:r>
+      <w:r>
+        <w:rPr>
+          <w:rFonts w:hint="default" w:ascii="Consolas" w:hAnsi="Consolas" w:eastAsia="Consolas" w:cs="Consolas"/>
+          <w:b w:val="0"/>
+          <w:bCs w:val="0"/>
+          <w:color w:val="BBBEBF"/>
+          <w:kern w:val="0"/>
+          <w:sz w:val="16"/>
+          <w:szCs w:val="16"/>
+          <w:shd w:val="clear" w:fill="121314"/>
+          <w:lang w:val="en-US" w:eastAsia="zh-CN" w:bidi="ar"/>
+          <w14:ligatures w14:val="standardContextual"/>
+        </w:rPr>
+        <w:t xml:space="preserve"> </w:t>
+      </w:r>
+      <w:r>
+        <w:rPr>
+          <w:rFonts w:hint="default" w:ascii="Consolas" w:hAnsi="Consolas" w:eastAsia="Consolas" w:cs="Consolas"/>
+          <w:b w:val="0"/>
+          <w:bCs w:val="0"/>
+          <w:color w:val="4EC9B0"/>
+          <w:kern w:val="0"/>
+          <w:sz w:val="16"/>
+          <w:szCs w:val="16"/>
+          <w:shd w:val="clear" w:fill="121314"/>
+          <w:lang w:val="en-US" w:eastAsia="zh-CN" w:bidi="ar"/>
+          <w14:ligatures w14:val="standardContextual"/>
+        </w:rPr>
+        <w:t>void</w:t>
+      </w:r>
+      <w:r>
+        <w:rPr>
+          <w:rFonts w:hint="default" w:ascii="Consolas" w:hAnsi="Consolas" w:eastAsia="Consolas" w:cs="Consolas"/>
+          <w:b w:val="0"/>
+          <w:bCs w:val="0"/>
+          <w:color w:val="BBBEBF"/>
+          <w:kern w:val="0"/>
+          <w:sz w:val="16"/>
+          <w:szCs w:val="16"/>
+          <w:shd w:val="clear" w:fill="121314"/>
+          <w:lang w:val="en-US" w:eastAsia="zh-CN" w:bidi="ar"/>
+          <w14:ligatures w14:val="standardContextual"/>
+        </w:rPr>
+        <w:t xml:space="preserve"> </w:t>
+      </w:r>
+      <w:r>
+        <w:rPr>
+          <w:rFonts w:hint="default" w:ascii="Consolas" w:hAnsi="Consolas" w:eastAsia="Consolas" w:cs="Consolas"/>
+          <w:b w:val="0"/>
+          <w:bCs w:val="0"/>
+          <w:color w:val="D2A8FF"/>
+          <w:kern w:val="0"/>
+          <w:sz w:val="16"/>
+          <w:szCs w:val="16"/>
+          <w:shd w:val="clear" w:fill="121314"/>
+          <w:lang w:val="en-US" w:eastAsia="zh-CN" w:bidi="ar"/>
+          <w14:ligatures w14:val="standardContextual"/>
+        </w:rPr>
+        <w:t>addItem</w:t>
+      </w:r>
+      <w:r>
+        <w:rPr>
+          <w:rFonts w:hint="default" w:ascii="Consolas" w:hAnsi="Consolas" w:eastAsia="Consolas" w:cs="Consolas"/>
+          <w:b w:val="0"/>
+          <w:bCs w:val="0"/>
+          <w:color w:val="BBBEBF"/>
+          <w:kern w:val="0"/>
+          <w:sz w:val="16"/>
+          <w:szCs w:val="16"/>
+          <w:shd w:val="clear" w:fill="121314"/>
+          <w:lang w:val="en-US" w:eastAsia="zh-CN" w:bidi="ar"/>
+          <w14:ligatures w14:val="standardContextual"/>
+        </w:rPr>
+        <w:t>(</w:t>
+      </w:r>
+      <w:r>
+        <w:rPr>
+          <w:rFonts w:hint="default" w:ascii="Consolas" w:hAnsi="Consolas" w:eastAsia="Consolas" w:cs="Consolas"/>
+          <w:b w:val="0"/>
+          <w:bCs w:val="0"/>
+          <w:color w:val="4EC9B0"/>
+          <w:kern w:val="0"/>
+          <w:sz w:val="16"/>
+          <w:szCs w:val="16"/>
+          <w:shd w:val="clear" w:fill="121314"/>
+          <w:lang w:val="en-US" w:eastAsia="zh-CN" w:bidi="ar"/>
+          <w14:ligatures w14:val="standardContextual"/>
+        </w:rPr>
+        <w:t>Product</w:t>
+      </w:r>
+      <w:r>
+        <w:rPr>
+          <w:rFonts w:hint="default" w:ascii="Consolas" w:hAnsi="Consolas" w:eastAsia="Consolas" w:cs="Consolas"/>
+          <w:b w:val="0"/>
+          <w:bCs w:val="0"/>
+          <w:color w:val="BBBEBF"/>
+          <w:kern w:val="0"/>
+          <w:sz w:val="16"/>
+          <w:szCs w:val="16"/>
+          <w:shd w:val="clear" w:fill="121314"/>
+          <w:lang w:val="en-US" w:eastAsia="zh-CN" w:bidi="ar"/>
+          <w14:ligatures w14:val="standardContextual"/>
+        </w:rPr>
+        <w:t xml:space="preserve"> </w:t>
+      </w:r>
+      <w:r>
+        <w:rPr>
+          <w:rFonts w:hint="default" w:ascii="Consolas" w:hAnsi="Consolas" w:eastAsia="Consolas" w:cs="Consolas"/>
+          <w:b w:val="0"/>
+          <w:bCs w:val="0"/>
+          <w:color w:val="FFA657"/>
+          <w:kern w:val="0"/>
+          <w:sz w:val="16"/>
+          <w:szCs w:val="16"/>
+          <w:shd w:val="clear" w:fill="121314"/>
+          <w:lang w:val="en-US" w:eastAsia="zh-CN" w:bidi="ar"/>
+          <w14:ligatures w14:val="standardContextual"/>
+        </w:rPr>
+        <w:t>product</w:t>
+      </w:r>
+      <w:r>
+        <w:rPr>
+          <w:rFonts w:hint="default" w:ascii="Consolas" w:hAnsi="Consolas" w:eastAsia="Consolas" w:cs="Consolas"/>
+          <w:b w:val="0"/>
+          <w:bCs w:val="0"/>
+          <w:color w:val="BBBEBF"/>
+          <w:kern w:val="0"/>
+          <w:sz w:val="16"/>
+          <w:szCs w:val="16"/>
+          <w:shd w:val="clear" w:fill="121314"/>
+          <w:lang w:val="en-US" w:eastAsia="zh-CN" w:bidi="ar"/>
+          <w14:ligatures w14:val="standardContextual"/>
+        </w:rPr>
+        <w:t>) {</w:t>
+      </w:r>
+    </w:p>
+    <w:p>
+      <w:pPr>
+        <w:keepNext w:val="0"/>
+        <w:keepLines w:val="0"/>
+        <w:widowControl/>
+        <w:suppressLineNumbers w:val="0"/>
+        <w:shd w:val="clear" w:fill="121314"/>
+        <w:spacing w:line="228" w:lineRule="atLeast"/>
+        <w:jc w:val="left"/>
+        <w:rPr>
+          <w:rFonts w:hint="default" w:ascii="Consolas" w:hAnsi="Consolas" w:eastAsia="Consolas" w:cs="Consolas"/>
+          <w:b w:val="0"/>
+          <w:bCs w:val="0"/>
+          <w:color w:val="BBBEBF"/>
+          <w:sz w:val="16"/>
+          <w:szCs w:val="16"/>
+        </w:rPr>
+      </w:pPr>
+      <w:r>
+        <w:rPr>
+          <w:rFonts w:hint="default" w:ascii="Consolas" w:hAnsi="Consolas" w:eastAsia="Consolas" w:cs="Consolas"/>
+          <w:b w:val="0"/>
+          <w:bCs w:val="0"/>
+          <w:color w:val="BBBEBF"/>
+          <w:kern w:val="0"/>
+          <w:sz w:val="16"/>
+          <w:szCs w:val="16"/>
+          <w:shd w:val="clear" w:fill="121314"/>
+          <w:lang w:val="en-US" w:eastAsia="zh-CN" w:bidi="ar"/>
+          <w14:ligatures w14:val="standardContextual"/>
+        </w:rPr>
+        <w:t xml:space="preserve">        </w:t>
+      </w:r>
+      <w:r>
+        <w:rPr>
+          <w:rFonts w:hint="default" w:ascii="Consolas" w:hAnsi="Consolas" w:eastAsia="Consolas" w:cs="Consolas"/>
+          <w:b w:val="0"/>
+          <w:bCs w:val="0"/>
+          <w:color w:val="C9D1D9"/>
+          <w:kern w:val="0"/>
+          <w:sz w:val="16"/>
+          <w:szCs w:val="16"/>
+          <w:shd w:val="clear" w:fill="121314"/>
+          <w:lang w:val="en-US" w:eastAsia="zh-CN" w:bidi="ar"/>
+          <w14:ligatures w14:val="standardContextual"/>
+        </w:rPr>
+        <w:t>items</w:t>
+      </w:r>
+      <w:r>
+        <w:rPr>
+          <w:rFonts w:hint="default" w:ascii="Consolas" w:hAnsi="Consolas" w:eastAsia="Consolas" w:cs="Consolas"/>
+          <w:b w:val="0"/>
+          <w:bCs w:val="0"/>
+          <w:color w:val="BBBEBF"/>
+          <w:kern w:val="0"/>
+          <w:sz w:val="16"/>
+          <w:szCs w:val="16"/>
+          <w:shd w:val="clear" w:fill="121314"/>
+          <w:lang w:val="en-US" w:eastAsia="zh-CN" w:bidi="ar"/>
+          <w14:ligatures w14:val="standardContextual"/>
+        </w:rPr>
+        <w:t>.</w:t>
+      </w:r>
+      <w:r>
+        <w:rPr>
+          <w:rFonts w:hint="default" w:ascii="Consolas" w:hAnsi="Consolas" w:eastAsia="Consolas" w:cs="Consolas"/>
+          <w:b w:val="0"/>
+          <w:bCs w:val="0"/>
+          <w:color w:val="4EC9B0"/>
+          <w:kern w:val="0"/>
+          <w:sz w:val="16"/>
+          <w:szCs w:val="16"/>
+          <w:shd w:val="clear" w:fill="121314"/>
+          <w:lang w:val="en-US" w:eastAsia="zh-CN" w:bidi="ar"/>
+          <w14:ligatures w14:val="standardContextual"/>
+        </w:rPr>
+        <w:t>add</w:t>
+      </w:r>
+      <w:r>
+        <w:rPr>
+          <w:rFonts w:hint="default" w:ascii="Consolas" w:hAnsi="Consolas" w:eastAsia="Consolas" w:cs="Consolas"/>
+          <w:b w:val="0"/>
+          <w:bCs w:val="0"/>
+          <w:color w:val="BBBEBF"/>
+          <w:kern w:val="0"/>
+          <w:sz w:val="16"/>
+          <w:szCs w:val="16"/>
+          <w:shd w:val="clear" w:fill="121314"/>
+          <w:lang w:val="en-US" w:eastAsia="zh-CN" w:bidi="ar"/>
+          <w14:ligatures w14:val="standardContextual"/>
+        </w:rPr>
+        <w:t>(</w:t>
+      </w:r>
+      <w:r>
+        <w:rPr>
+          <w:rFonts w:hint="default" w:ascii="Consolas" w:hAnsi="Consolas" w:eastAsia="Consolas" w:cs="Consolas"/>
+          <w:b w:val="0"/>
+          <w:bCs w:val="0"/>
+          <w:color w:val="4EC9B0"/>
+          <w:kern w:val="0"/>
+          <w:sz w:val="16"/>
+          <w:szCs w:val="16"/>
+          <w:shd w:val="clear" w:fill="121314"/>
+          <w:lang w:val="en-US" w:eastAsia="zh-CN" w:bidi="ar"/>
+          <w14:ligatures w14:val="standardContextual"/>
+        </w:rPr>
+        <w:t>item</w:t>
+      </w:r>
+      <w:r>
+        <w:rPr>
+          <w:rFonts w:hint="default" w:ascii="Consolas" w:hAnsi="Consolas" w:eastAsia="Consolas" w:cs="Consolas"/>
+          <w:b w:val="0"/>
+          <w:bCs w:val="0"/>
+          <w:color w:val="BBBEBF"/>
+          <w:kern w:val="0"/>
+          <w:sz w:val="16"/>
+          <w:szCs w:val="16"/>
+          <w:shd w:val="clear" w:fill="121314"/>
+          <w:lang w:val="en-US" w:eastAsia="zh-CN" w:bidi="ar"/>
+          <w14:ligatures w14:val="standardContextual"/>
+        </w:rPr>
+        <w:t>);</w:t>
+      </w:r>
+    </w:p>
+    <w:p>
+      <w:pPr>
+        <w:keepNext w:val="0"/>
+        <w:keepLines w:val="0"/>
+        <w:widowControl/>
+        <w:suppressLineNumbers w:val="0"/>
+        <w:shd w:val="clear" w:fill="121314"/>
+        <w:spacing w:line="228" w:lineRule="atLeast"/>
+        <w:jc w:val="left"/>
+        <w:rPr>
+          <w:rFonts w:hint="default" w:ascii="Consolas" w:hAnsi="Consolas" w:eastAsia="Consolas" w:cs="Consolas"/>
+          <w:b w:val="0"/>
+          <w:bCs w:val="0"/>
+          <w:color w:val="BBBEBF"/>
+          <w:sz w:val="16"/>
+          <w:szCs w:val="16"/>
+        </w:rPr>
+      </w:pPr>
+      <w:r>
+        <w:rPr>
+          <w:rFonts w:hint="default" w:ascii="Consolas" w:hAnsi="Consolas" w:eastAsia="Consolas" w:cs="Consolas"/>
+          <w:b w:val="0"/>
+          <w:bCs w:val="0"/>
+          <w:color w:val="BBBEBF"/>
+          <w:kern w:val="0"/>
+          <w:sz w:val="16"/>
+          <w:szCs w:val="16"/>
+          <w:shd w:val="clear" w:fill="121314"/>
+          <w:lang w:val="en-US" w:eastAsia="zh-CN" w:bidi="ar"/>
+          <w14:ligatures w14:val="standardContextual"/>
+        </w:rPr>
+        <w:t>    }</w:t>
+      </w:r>
+    </w:p>
+    <w:p>
+      <w:pPr>
+        <w:keepNext w:val="0"/>
+        <w:keepLines w:val="0"/>
+        <w:widowControl/>
+        <w:suppressLineNumbers w:val="0"/>
+        <w:shd w:val="clear" w:fill="121314"/>
+        <w:spacing w:line="228" w:lineRule="atLeast"/>
+        <w:jc w:val="left"/>
+        <w:rPr>
+          <w:rFonts w:hint="default" w:ascii="Consolas" w:hAnsi="Consolas" w:eastAsia="Consolas" w:cs="Consolas"/>
+          <w:b w:val="0"/>
+          <w:bCs w:val="0"/>
+          <w:color w:val="BBBEBF"/>
+          <w:sz w:val="16"/>
+          <w:szCs w:val="16"/>
+        </w:rPr>
+      </w:pPr>
+      <w:r>
+        <w:rPr>
+          <w:rFonts w:hint="default" w:ascii="Consolas" w:hAnsi="Consolas" w:eastAsia="Consolas" w:cs="Consolas"/>
+          <w:b w:val="0"/>
+          <w:bCs w:val="0"/>
+          <w:color w:val="BBBEBF"/>
+          <w:kern w:val="0"/>
+          <w:sz w:val="16"/>
+          <w:szCs w:val="16"/>
+          <w:shd w:val="clear" w:fill="121314"/>
+          <w:lang w:val="en-US" w:eastAsia="zh-CN" w:bidi="ar"/>
+          <w14:ligatures w14:val="standardContextual"/>
+        </w:rPr>
+        <w:t>}</w:t>
+      </w:r>
+    </w:p>
+    <w:p>
+      <w:pPr>
+        <w:pStyle w:val="29"/>
+        <w:numPr>
+          <w:ilvl w:val="0"/>
+          <w:numId w:val="0"/>
+        </w:numPr>
+        <w:rPr>
+          <w:rFonts w:hint="default"/>
+          <w:u w:val="none"/>
+          <w:lang w:val="en-US"/>
+        </w:rPr>
+      </w:pPr>
+    </w:p>
+    <w:p>
+      <w:pPr>
+        <w:pStyle w:val="29"/>
+        <w:numPr>
+          <w:ilvl w:val="0"/>
+          <w:numId w:val="0"/>
+        </w:numPr>
+        <w:rPr>
+          <w:rFonts w:hint="default"/>
+          <w:u w:val="none"/>
+          <w:lang w:val="en-US"/>
+        </w:rPr>
+      </w:pPr>
+      <w:r>
+        <w:rPr>
+          <w:rFonts w:hint="default"/>
+          <w:u w:val="none"/>
+          <w:lang w:val="en-US"/>
+        </w:rPr>
+        <w:t>Adding elements:</w:t>
+      </w:r>
+    </w:p>
+    <w:p>
+      <w:pPr>
+        <w:keepNext w:val="0"/>
+        <w:keepLines w:val="0"/>
+        <w:widowControl/>
+        <w:suppressLineNumbers w:val="0"/>
+        <w:shd w:val="clear" w:fill="121314"/>
+        <w:spacing w:line="228" w:lineRule="atLeast"/>
+        <w:jc w:val="left"/>
+        <w:rPr>
+          <w:rFonts w:hint="default" w:ascii="Consolas" w:hAnsi="Consolas" w:eastAsia="Consolas" w:cs="Consolas"/>
+          <w:b w:val="0"/>
+          <w:bCs w:val="0"/>
+          <w:color w:val="BBBEBF"/>
+          <w:sz w:val="16"/>
+          <w:szCs w:val="16"/>
+          <w:lang w:val="en-US"/>
+        </w:rPr>
+      </w:pPr>
+      <w:r>
+        <w:rPr>
+          <w:rFonts w:hint="default" w:ascii="Consolas" w:hAnsi="Consolas" w:eastAsia="Consolas" w:cs="Consolas"/>
+          <w:b w:val="0"/>
+          <w:bCs w:val="0"/>
+          <w:color w:val="4EC9B0"/>
+          <w:kern w:val="0"/>
+          <w:sz w:val="16"/>
+          <w:szCs w:val="16"/>
+          <w:shd w:val="clear" w:fill="121314"/>
+          <w:lang w:val="en-US" w:eastAsia="zh-CN" w:bidi="ar"/>
+          <w14:ligatures w14:val="standardContextual"/>
+        </w:rPr>
+        <w:t>students</w:t>
+      </w:r>
+      <w:r>
+        <w:rPr>
+          <w:rFonts w:hint="default" w:ascii="Consolas" w:hAnsi="Consolas" w:eastAsia="Consolas" w:cs="Consolas"/>
+          <w:b w:val="0"/>
+          <w:bCs w:val="0"/>
+          <w:color w:val="BBBEBF"/>
+          <w:kern w:val="0"/>
+          <w:sz w:val="16"/>
+          <w:szCs w:val="16"/>
+          <w:shd w:val="clear" w:fill="121314"/>
+          <w:lang w:val="en-US" w:eastAsia="zh-CN" w:bidi="ar"/>
+          <w14:ligatures w14:val="standardContextual"/>
+        </w:rPr>
+        <w:t>.</w:t>
+      </w:r>
+      <w:r>
+        <w:rPr>
+          <w:rFonts w:hint="default" w:ascii="Consolas" w:hAnsi="Consolas" w:eastAsia="Consolas" w:cs="Consolas"/>
+          <w:b w:val="0"/>
+          <w:bCs w:val="0"/>
+          <w:color w:val="4EC9B0"/>
+          <w:kern w:val="0"/>
+          <w:sz w:val="16"/>
+          <w:szCs w:val="16"/>
+          <w:shd w:val="clear" w:fill="121314"/>
+          <w:lang w:val="en-US" w:eastAsia="zh-CN" w:bidi="ar"/>
+          <w14:ligatures w14:val="standardContextual"/>
+        </w:rPr>
+        <w:t>add</w:t>
+      </w:r>
+      <w:r>
+        <w:rPr>
+          <w:rFonts w:hint="default" w:ascii="Consolas" w:hAnsi="Consolas" w:eastAsia="Consolas" w:cs="Consolas"/>
+          <w:b w:val="0"/>
+          <w:bCs w:val="0"/>
+          <w:color w:val="BBBEBF"/>
+          <w:kern w:val="0"/>
+          <w:sz w:val="16"/>
+          <w:szCs w:val="16"/>
+          <w:shd w:val="clear" w:fill="121314"/>
+          <w:lang w:val="en-US" w:eastAsia="zh-CN" w:bidi="ar"/>
+          <w14:ligatures w14:val="standardContextual"/>
+        </w:rPr>
+        <w:t>(</w:t>
+      </w:r>
+      <w:r>
+        <w:rPr>
+          <w:rFonts w:hint="default" w:ascii="Consolas" w:hAnsi="Consolas" w:eastAsia="Consolas" w:cs="Consolas"/>
+          <w:b w:val="0"/>
+          <w:bCs w:val="0"/>
+          <w:color w:val="A5D6FF"/>
+          <w:kern w:val="0"/>
+          <w:sz w:val="16"/>
+          <w:szCs w:val="16"/>
+          <w:shd w:val="clear" w:fill="121314"/>
+          <w:lang w:val="en-US" w:eastAsia="zh-CN" w:bidi="ar"/>
+          <w14:ligatures w14:val="standardContextual"/>
+        </w:rPr>
+        <w:t>"Alice"</w:t>
+      </w:r>
+      <w:r>
+        <w:rPr>
+          <w:rFonts w:hint="default" w:ascii="Consolas" w:hAnsi="Consolas" w:eastAsia="Consolas" w:cs="Consolas"/>
+          <w:b w:val="0"/>
+          <w:bCs w:val="0"/>
+          <w:color w:val="BBBEBF"/>
+          <w:kern w:val="0"/>
+          <w:sz w:val="16"/>
+          <w:szCs w:val="16"/>
+          <w:shd w:val="clear" w:fill="121314"/>
+          <w:lang w:val="en-US" w:eastAsia="zh-CN" w:bidi="ar"/>
+          <w14:ligatures w14:val="standardContextual"/>
+        </w:rPr>
+        <w:t>);</w:t>
+      </w:r>
+    </w:p>
+    <w:p>
+      <w:pPr>
+        <w:pStyle w:val="29"/>
+        <w:numPr>
+          <w:ilvl w:val="0"/>
+          <w:numId w:val="0"/>
+        </w:numPr>
+        <w:rPr>
+          <w:rFonts w:hint="default"/>
+          <w:u w:val="none"/>
+          <w:lang w:val="en-US"/>
+        </w:rPr>
+      </w:pPr>
+    </w:p>
+    <w:p>
+      <w:pPr>
+        <w:pStyle w:val="29"/>
+        <w:numPr>
+          <w:ilvl w:val="0"/>
+          <w:numId w:val="0"/>
+        </w:numPr>
+        <w:rPr>
+          <w:rFonts w:hint="default"/>
+          <w:u w:val="none"/>
+          <w:lang w:val="en-US"/>
+        </w:rPr>
+      </w:pPr>
+      <w:r>
+        <w:rPr>
+          <w:rFonts w:hint="default"/>
+          <w:u w:val="none"/>
+          <w:lang w:val="en-US"/>
+        </w:rPr>
+        <w:t>Adding at specific index:</w:t>
+      </w:r>
+    </w:p>
+    <w:p>
+      <w:pPr>
+        <w:keepNext w:val="0"/>
+        <w:keepLines w:val="0"/>
+        <w:widowControl/>
+        <w:suppressLineNumbers w:val="0"/>
+        <w:shd w:val="clear" w:fill="121314"/>
+        <w:spacing w:line="228" w:lineRule="atLeast"/>
+        <w:jc w:val="left"/>
+        <w:rPr>
+          <w:rFonts w:hint="default" w:ascii="Consolas" w:hAnsi="Consolas" w:eastAsia="Consolas" w:cs="Consolas"/>
+          <w:b w:val="0"/>
+          <w:bCs w:val="0"/>
+          <w:color w:val="BBBEBF"/>
+          <w:sz w:val="16"/>
+          <w:szCs w:val="16"/>
+          <w:lang w:val="en-US"/>
+        </w:rPr>
+      </w:pPr>
+      <w:r>
+        <w:rPr>
+          <w:rFonts w:hint="default" w:ascii="Consolas" w:hAnsi="Consolas" w:eastAsia="Consolas" w:cs="Consolas"/>
+          <w:b w:val="0"/>
+          <w:bCs w:val="0"/>
+          <w:color w:val="4EC9B0"/>
+          <w:kern w:val="0"/>
+          <w:sz w:val="16"/>
+          <w:szCs w:val="16"/>
+          <w:shd w:val="clear" w:fill="121314"/>
+          <w:lang w:val="en-US" w:eastAsia="zh-CN" w:bidi="ar"/>
+          <w14:ligatures w14:val="standardContextual"/>
+        </w:rPr>
+        <w:t>students</w:t>
+      </w:r>
+      <w:r>
+        <w:rPr>
+          <w:rFonts w:hint="default" w:ascii="Consolas" w:hAnsi="Consolas" w:eastAsia="Consolas" w:cs="Consolas"/>
+          <w:b w:val="0"/>
+          <w:bCs w:val="0"/>
+          <w:color w:val="BBBEBF"/>
+          <w:kern w:val="0"/>
+          <w:sz w:val="16"/>
+          <w:szCs w:val="16"/>
+          <w:shd w:val="clear" w:fill="121314"/>
+          <w:lang w:val="en-US" w:eastAsia="zh-CN" w:bidi="ar"/>
+          <w14:ligatures w14:val="standardContextual"/>
+        </w:rPr>
+        <w:t>.</w:t>
+      </w:r>
+      <w:r>
+        <w:rPr>
+          <w:rFonts w:hint="default" w:ascii="Consolas" w:hAnsi="Consolas" w:eastAsia="Consolas" w:cs="Consolas"/>
+          <w:b w:val="0"/>
+          <w:bCs w:val="0"/>
+          <w:color w:val="4EC9B0"/>
+          <w:kern w:val="0"/>
+          <w:sz w:val="16"/>
+          <w:szCs w:val="16"/>
+          <w:shd w:val="clear" w:fill="121314"/>
+          <w:lang w:val="en-US" w:eastAsia="zh-CN" w:bidi="ar"/>
+          <w14:ligatures w14:val="standardContextual"/>
+        </w:rPr>
+        <w:t>add</w:t>
+      </w:r>
+      <w:r>
+        <w:rPr>
+          <w:rFonts w:hint="default" w:ascii="Consolas" w:hAnsi="Consolas" w:eastAsia="Consolas" w:cs="Consolas"/>
+          <w:b w:val="0"/>
+          <w:bCs w:val="0"/>
+          <w:color w:val="BBBEBF"/>
+          <w:kern w:val="0"/>
+          <w:sz w:val="16"/>
+          <w:szCs w:val="16"/>
+          <w:shd w:val="clear" w:fill="121314"/>
+          <w:lang w:val="en-US" w:eastAsia="zh-CN" w:bidi="ar"/>
+          <w14:ligatures w14:val="standardContextual"/>
+        </w:rPr>
+        <w:t>(1,</w:t>
+      </w:r>
+      <w:r>
+        <w:rPr>
+          <w:rFonts w:hint="default" w:ascii="Consolas" w:hAnsi="Consolas" w:eastAsia="Consolas" w:cs="Consolas"/>
+          <w:b w:val="0"/>
+          <w:bCs w:val="0"/>
+          <w:color w:val="A5D6FF"/>
+          <w:kern w:val="0"/>
+          <w:sz w:val="16"/>
+          <w:szCs w:val="16"/>
+          <w:shd w:val="clear" w:fill="121314"/>
+          <w:lang w:val="en-US" w:eastAsia="zh-CN" w:bidi="ar"/>
+          <w14:ligatures w14:val="standardContextual"/>
+        </w:rPr>
+        <w:t>"Alice"</w:t>
+      </w:r>
+      <w:r>
+        <w:rPr>
+          <w:rFonts w:hint="default" w:ascii="Consolas" w:hAnsi="Consolas" w:eastAsia="Consolas" w:cs="Consolas"/>
+          <w:b w:val="0"/>
+          <w:bCs w:val="0"/>
+          <w:color w:val="BBBEBF"/>
+          <w:kern w:val="0"/>
+          <w:sz w:val="16"/>
+          <w:szCs w:val="16"/>
+          <w:shd w:val="clear" w:fill="121314"/>
+          <w:lang w:val="en-US" w:eastAsia="zh-CN" w:bidi="ar"/>
+          <w14:ligatures w14:val="standardContextual"/>
+        </w:rPr>
+        <w:t>);</w:t>
+      </w:r>
+    </w:p>
+    <w:p>
+      <w:pPr>
+        <w:pStyle w:val="29"/>
+        <w:numPr>
+          <w:ilvl w:val="0"/>
+          <w:numId w:val="0"/>
+        </w:numPr>
+        <w:rPr>
+          <w:rFonts w:hint="default"/>
+          <w:u w:val="none"/>
+          <w:lang w:val="en-US"/>
+        </w:rPr>
+      </w:pPr>
+    </w:p>
+    <w:p>
+      <w:pPr>
+        <w:pStyle w:val="29"/>
+        <w:numPr>
+          <w:ilvl w:val="0"/>
+          <w:numId w:val="0"/>
+        </w:numPr>
+        <w:rPr>
+          <w:rFonts w:hint="default"/>
+          <w:u w:val="none"/>
+          <w:lang w:val="en-US"/>
+        </w:rPr>
+      </w:pPr>
+      <w:r>
+        <w:rPr>
+          <w:rFonts w:hint="default"/>
+          <w:u w:val="none"/>
+          <w:lang w:val="en-US"/>
+        </w:rPr>
+        <w:t>Merging two lists:</w:t>
+      </w:r>
+    </w:p>
+    <w:p>
+      <w:pPr>
+        <w:keepNext w:val="0"/>
+        <w:keepLines w:val="0"/>
+        <w:widowControl/>
+        <w:suppressLineNumbers w:val="0"/>
+        <w:shd w:val="clear" w:fill="121314"/>
+        <w:spacing w:line="228" w:lineRule="atLeast"/>
+        <w:jc w:val="left"/>
+        <w:rPr>
+          <w:rFonts w:hint="default" w:ascii="Consolas" w:hAnsi="Consolas" w:eastAsia="Consolas" w:cs="Consolas"/>
+          <w:b w:val="0"/>
+          <w:bCs w:val="0"/>
+          <w:color w:val="BBBEBF"/>
+          <w:sz w:val="16"/>
+          <w:szCs w:val="16"/>
+          <w:lang w:val="en-US"/>
+        </w:rPr>
+      </w:pPr>
+      <w:r>
+        <w:rPr>
+          <w:rFonts w:hint="default" w:ascii="Consolas" w:hAnsi="Consolas" w:eastAsia="Consolas" w:cs="Consolas"/>
+          <w:b w:val="0"/>
+          <w:bCs w:val="0"/>
+          <w:color w:val="4EC9B0"/>
+          <w:kern w:val="0"/>
+          <w:sz w:val="16"/>
+          <w:szCs w:val="16"/>
+          <w:shd w:val="clear" w:fill="121314"/>
+          <w:lang w:val="en-US" w:eastAsia="zh-CN" w:bidi="ar"/>
+          <w14:ligatures w14:val="standardContextual"/>
+        </w:rPr>
+        <w:t>students</w:t>
+      </w:r>
+      <w:r>
+        <w:rPr>
+          <w:rFonts w:hint="default" w:ascii="Consolas" w:hAnsi="Consolas" w:eastAsia="Consolas" w:cs="Consolas"/>
+          <w:b w:val="0"/>
+          <w:bCs w:val="0"/>
+          <w:color w:val="BBBEBF"/>
+          <w:kern w:val="0"/>
+          <w:sz w:val="16"/>
+          <w:szCs w:val="16"/>
+          <w:shd w:val="clear" w:fill="121314"/>
+          <w:lang w:val="en-US" w:eastAsia="zh-CN" w:bidi="ar"/>
+          <w14:ligatures w14:val="standardContextual"/>
+        </w:rPr>
+        <w:t>.addall(morestudents);</w:t>
+      </w:r>
+    </w:p>
+    <w:p>
+      <w:pPr>
+        <w:pStyle w:val="29"/>
+        <w:numPr>
+          <w:ilvl w:val="0"/>
+          <w:numId w:val="0"/>
+        </w:numPr>
+        <w:rPr>
+          <w:rFonts w:hint="default"/>
+          <w:u w:val="none"/>
+          <w:lang w:val="en-US"/>
+        </w:rPr>
+      </w:pPr>
+    </w:p>
+    <w:p>
+      <w:pPr>
+        <w:pStyle w:val="29"/>
+        <w:numPr>
+          <w:ilvl w:val="0"/>
+          <w:numId w:val="0"/>
+        </w:numPr>
+        <w:rPr>
+          <w:rFonts w:hint="default"/>
+          <w:u w:val="none"/>
+          <w:lang w:val="en-US"/>
+        </w:rPr>
+      </w:pPr>
+      <w:r>
+        <w:rPr>
+          <w:rFonts w:hint="default"/>
+          <w:u w:val="none"/>
+          <w:lang w:val="en-US"/>
+        </w:rPr>
+        <w:t>Accessing elements:</w:t>
+      </w:r>
+    </w:p>
+    <w:p>
+      <w:pPr>
+        <w:keepNext w:val="0"/>
+        <w:keepLines w:val="0"/>
+        <w:widowControl/>
+        <w:suppressLineNumbers w:val="0"/>
+        <w:shd w:val="clear" w:fill="121314"/>
+        <w:spacing w:line="228" w:lineRule="atLeast"/>
+        <w:jc w:val="left"/>
+        <w:rPr>
+          <w:rFonts w:hint="default" w:ascii="Consolas" w:hAnsi="Consolas" w:eastAsia="Consolas" w:cs="Consolas"/>
+          <w:b w:val="0"/>
+          <w:bCs w:val="0"/>
+          <w:color w:val="4EC9B0"/>
+          <w:kern w:val="0"/>
+          <w:sz w:val="16"/>
+          <w:szCs w:val="16"/>
+          <w:shd w:val="clear" w:fill="121314"/>
+          <w:lang w:val="en-US" w:eastAsia="zh-CN" w:bidi="ar"/>
+          <w14:ligatures w14:val="standardContextual"/>
+        </w:rPr>
+      </w:pPr>
+      <w:r>
+        <w:rPr>
+          <w:rFonts w:hint="default" w:ascii="Consolas" w:hAnsi="Consolas" w:eastAsia="Consolas" w:cs="Consolas"/>
+          <w:b w:val="0"/>
+          <w:bCs w:val="0"/>
+          <w:color w:val="4EC9B0"/>
+          <w:kern w:val="0"/>
+          <w:sz w:val="16"/>
+          <w:szCs w:val="16"/>
+          <w:shd w:val="clear" w:fill="121314"/>
+          <w:lang w:val="en-US" w:eastAsia="zh-CN" w:bidi="ar"/>
+          <w14:ligatures w14:val="standardContextual"/>
+        </w:rPr>
+        <w:t>String first = student.get(0); --------&gt; index 1</w:t>
+      </w:r>
+    </w:p>
+    <w:p>
+      <w:pPr>
+        <w:pStyle w:val="29"/>
+        <w:numPr>
+          <w:ilvl w:val="0"/>
+          <w:numId w:val="0"/>
+        </w:numPr>
+        <w:rPr>
+          <w:rFonts w:hint="default"/>
+          <w:u w:val="none"/>
+          <w:lang w:val="en-US" w:eastAsia="zh-CN"/>
+        </w:rPr>
+      </w:pPr>
+    </w:p>
+    <w:p>
+      <w:pPr>
+        <w:pStyle w:val="29"/>
+        <w:numPr>
+          <w:ilvl w:val="0"/>
+          <w:numId w:val="0"/>
+        </w:numPr>
+        <w:rPr>
+          <w:rFonts w:hint="default"/>
+          <w:u w:val="none"/>
+          <w:lang w:val="en-US" w:eastAsia="zh-CN"/>
+        </w:rPr>
+      </w:pPr>
+      <w:r>
+        <w:rPr>
+          <w:rFonts w:hint="default"/>
+          <w:u w:val="none"/>
+          <w:lang w:val="en-US" w:eastAsia="zh-CN"/>
+        </w:rPr>
+        <w:t>Removing elements:</w:t>
+      </w:r>
+    </w:p>
+    <w:p>
+      <w:pPr>
+        <w:keepNext w:val="0"/>
+        <w:keepLines w:val="0"/>
+        <w:widowControl/>
+        <w:suppressLineNumbers w:val="0"/>
+        <w:shd w:val="clear" w:fill="121314"/>
+        <w:spacing w:line="228" w:lineRule="atLeast"/>
+        <w:jc w:val="left"/>
+        <w:rPr>
+          <w:rFonts w:ascii="Consolas" w:hAnsi="Consolas" w:eastAsia="Consolas" w:cs="Consolas"/>
+          <w:b w:val="0"/>
+          <w:bCs w:val="0"/>
+          <w:color w:val="BBBEBF"/>
+          <w:sz w:val="16"/>
+          <w:szCs w:val="16"/>
+        </w:rPr>
+      </w:pPr>
+      <w:r>
+        <w:rPr>
+          <w:rFonts w:hint="default" w:ascii="Consolas" w:hAnsi="Consolas" w:eastAsia="Consolas" w:cs="Consolas"/>
+          <w:b w:val="0"/>
+          <w:bCs w:val="0"/>
+          <w:color w:val="C9D1D9"/>
+          <w:kern w:val="0"/>
+          <w:sz w:val="16"/>
+          <w:szCs w:val="16"/>
+          <w:shd w:val="clear" w:fill="121314"/>
+          <w:lang w:val="en-US" w:eastAsia="zh-CN" w:bidi="ar"/>
+          <w14:ligatures w14:val="standardContextual"/>
+        </w:rPr>
+        <w:t>Student</w:t>
+      </w:r>
+      <w:r>
+        <w:rPr>
+          <w:rFonts w:hint="default" w:ascii="Consolas" w:hAnsi="Consolas" w:eastAsia="Consolas" w:cs="Consolas"/>
+          <w:b w:val="0"/>
+          <w:bCs w:val="0"/>
+          <w:color w:val="BBBEBF"/>
+          <w:kern w:val="0"/>
+          <w:sz w:val="16"/>
+          <w:szCs w:val="16"/>
+          <w:shd w:val="clear" w:fill="121314"/>
+          <w:lang w:val="en-US" w:eastAsia="zh-CN" w:bidi="ar"/>
+          <w14:ligatures w14:val="standardContextual"/>
+        </w:rPr>
+        <w:t>.</w:t>
+      </w:r>
+      <w:r>
+        <w:rPr>
+          <w:rFonts w:hint="default" w:ascii="Consolas" w:hAnsi="Consolas" w:eastAsia="Consolas" w:cs="Consolas"/>
+          <w:b w:val="0"/>
+          <w:bCs w:val="0"/>
+          <w:color w:val="D2A8FF"/>
+          <w:kern w:val="0"/>
+          <w:sz w:val="16"/>
+          <w:szCs w:val="16"/>
+          <w:shd w:val="clear" w:fill="121314"/>
+          <w:lang w:val="en-US" w:eastAsia="zh-CN" w:bidi="ar"/>
+          <w14:ligatures w14:val="standardContextual"/>
+        </w:rPr>
+        <w:t>remove</w:t>
+      </w:r>
+      <w:r>
+        <w:rPr>
+          <w:rFonts w:hint="default" w:ascii="Consolas" w:hAnsi="Consolas" w:eastAsia="Consolas" w:cs="Consolas"/>
+          <w:b w:val="0"/>
+          <w:bCs w:val="0"/>
+          <w:color w:val="BBBEBF"/>
+          <w:kern w:val="0"/>
+          <w:sz w:val="16"/>
+          <w:szCs w:val="16"/>
+          <w:shd w:val="clear" w:fill="121314"/>
+          <w:lang w:val="en-US" w:eastAsia="zh-CN" w:bidi="ar"/>
+          <w14:ligatures w14:val="standardContextual"/>
+        </w:rPr>
+        <w:t>(</w:t>
+      </w:r>
+      <w:r>
+        <w:rPr>
+          <w:rFonts w:hint="default" w:ascii="Consolas" w:hAnsi="Consolas" w:eastAsia="Consolas" w:cs="Consolas"/>
+          <w:b w:val="0"/>
+          <w:bCs w:val="0"/>
+          <w:color w:val="B5CEA8"/>
+          <w:kern w:val="0"/>
+          <w:sz w:val="16"/>
+          <w:szCs w:val="16"/>
+          <w:shd w:val="clear" w:fill="121314"/>
+          <w:lang w:val="en-US" w:eastAsia="zh-CN" w:bidi="ar"/>
+          <w14:ligatures w14:val="standardContextual"/>
+        </w:rPr>
+        <w:t>1</w:t>
+      </w:r>
+      <w:r>
+        <w:rPr>
+          <w:rFonts w:hint="default" w:ascii="Consolas" w:hAnsi="Consolas" w:eastAsia="Consolas" w:cs="Consolas"/>
+          <w:b w:val="0"/>
+          <w:bCs w:val="0"/>
+          <w:color w:val="BBBEBF"/>
+          <w:kern w:val="0"/>
+          <w:sz w:val="16"/>
+          <w:szCs w:val="16"/>
+          <w:shd w:val="clear" w:fill="121314"/>
+          <w:lang w:val="en-US" w:eastAsia="zh-CN" w:bidi="ar"/>
+          <w14:ligatures w14:val="standardContextual"/>
+        </w:rPr>
+        <w:t>);</w:t>
+      </w:r>
+    </w:p>
+    <w:p>
+      <w:pPr>
+        <w:keepNext w:val="0"/>
+        <w:keepLines w:val="0"/>
+        <w:widowControl/>
+        <w:suppressLineNumbers w:val="0"/>
+        <w:shd w:val="clear" w:fill="121314"/>
+        <w:spacing w:line="228" w:lineRule="atLeast"/>
+        <w:jc w:val="left"/>
+        <w:rPr>
+          <w:rFonts w:hint="default" w:ascii="Consolas" w:hAnsi="Consolas" w:eastAsia="Consolas" w:cs="Consolas"/>
+          <w:b w:val="0"/>
+          <w:bCs w:val="0"/>
+          <w:color w:val="BBBEBF"/>
+          <w:sz w:val="16"/>
+          <w:szCs w:val="16"/>
+        </w:rPr>
+      </w:pPr>
+      <w:r>
+        <w:rPr>
+          <w:rFonts w:hint="default" w:ascii="Consolas" w:hAnsi="Consolas" w:eastAsia="Consolas" w:cs="Consolas"/>
+          <w:b w:val="0"/>
+          <w:bCs w:val="0"/>
+          <w:color w:val="C9D1D9"/>
+          <w:kern w:val="0"/>
+          <w:sz w:val="16"/>
+          <w:szCs w:val="16"/>
+          <w:shd w:val="clear" w:fill="121314"/>
+          <w:lang w:val="en-US" w:eastAsia="zh-CN" w:bidi="ar"/>
+          <w14:ligatures w14:val="standardContextual"/>
+        </w:rPr>
+        <w:t>Student</w:t>
+      </w:r>
+      <w:r>
+        <w:rPr>
+          <w:rFonts w:hint="default" w:ascii="Consolas" w:hAnsi="Consolas" w:eastAsia="Consolas" w:cs="Consolas"/>
+          <w:b w:val="0"/>
+          <w:bCs w:val="0"/>
+          <w:color w:val="BBBEBF"/>
+          <w:kern w:val="0"/>
+          <w:sz w:val="16"/>
+          <w:szCs w:val="16"/>
+          <w:shd w:val="clear" w:fill="121314"/>
+          <w:lang w:val="en-US" w:eastAsia="zh-CN" w:bidi="ar"/>
+          <w14:ligatures w14:val="standardContextual"/>
+        </w:rPr>
+        <w:t>.</w:t>
+      </w:r>
+      <w:r>
+        <w:rPr>
+          <w:rFonts w:hint="default" w:ascii="Consolas" w:hAnsi="Consolas" w:eastAsia="Consolas" w:cs="Consolas"/>
+          <w:b w:val="0"/>
+          <w:bCs w:val="0"/>
+          <w:color w:val="D2A8FF"/>
+          <w:kern w:val="0"/>
+          <w:sz w:val="16"/>
+          <w:szCs w:val="16"/>
+          <w:shd w:val="clear" w:fill="121314"/>
+          <w:lang w:val="en-US" w:eastAsia="zh-CN" w:bidi="ar"/>
+          <w14:ligatures w14:val="standardContextual"/>
+        </w:rPr>
+        <w:t>remove</w:t>
+      </w:r>
+      <w:r>
+        <w:rPr>
+          <w:rFonts w:hint="default" w:ascii="Consolas" w:hAnsi="Consolas" w:eastAsia="Consolas" w:cs="Consolas"/>
+          <w:b w:val="0"/>
+          <w:bCs w:val="0"/>
+          <w:color w:val="BBBEBF"/>
+          <w:kern w:val="0"/>
+          <w:sz w:val="16"/>
+          <w:szCs w:val="16"/>
+          <w:shd w:val="clear" w:fill="121314"/>
+          <w:lang w:val="en-US" w:eastAsia="zh-CN" w:bidi="ar"/>
+          <w14:ligatures w14:val="standardContextual"/>
+        </w:rPr>
+        <w:t>(“Bob”);</w:t>
+      </w:r>
+    </w:p>
+    <w:p>
+      <w:pPr>
+        <w:pStyle w:val="29"/>
+        <w:numPr>
+          <w:ilvl w:val="0"/>
+          <w:numId w:val="0"/>
+        </w:numPr>
+        <w:rPr>
+          <w:rFonts w:hint="default"/>
+          <w:u w:val="none"/>
+          <w:lang w:val="en-US" w:eastAsia="zh-CN"/>
+        </w:rPr>
+      </w:pPr>
+    </w:p>
+    <w:p>
+      <w:pPr>
+        <w:pStyle w:val="29"/>
+        <w:numPr>
+          <w:ilvl w:val="0"/>
+          <w:numId w:val="0"/>
+        </w:numPr>
+        <w:rPr>
+          <w:rFonts w:hint="default"/>
+          <w:u w:val="none"/>
+          <w:lang w:val="en-US" w:eastAsia="zh-CN"/>
+        </w:rPr>
+      </w:pPr>
+      <w:r>
+        <w:rPr>
+          <w:rFonts w:hint="default"/>
+          <w:u w:val="none"/>
+          <w:lang w:val="en-US" w:eastAsia="zh-CN"/>
+        </w:rPr>
+        <w:t>Removing all elements matching a condition:</w:t>
+      </w:r>
+    </w:p>
+    <w:p>
+      <w:pPr>
+        <w:keepNext w:val="0"/>
+        <w:keepLines w:val="0"/>
+        <w:widowControl/>
+        <w:suppressLineNumbers w:val="0"/>
+        <w:shd w:val="clear" w:fill="121314"/>
+        <w:spacing w:line="228" w:lineRule="atLeast"/>
+        <w:jc w:val="left"/>
+        <w:rPr>
+          <w:rFonts w:hint="default" w:ascii="Consolas" w:hAnsi="Consolas" w:eastAsia="Consolas" w:cs="Consolas"/>
+          <w:b w:val="0"/>
+          <w:bCs w:val="0"/>
+          <w:color w:val="BBBEBF"/>
+          <w:sz w:val="16"/>
+          <w:szCs w:val="16"/>
+        </w:rPr>
+      </w:pPr>
+      <w:r>
+        <w:rPr>
+          <w:rFonts w:hint="default" w:ascii="Consolas" w:hAnsi="Consolas" w:eastAsia="Consolas" w:cs="Consolas"/>
+          <w:b w:val="0"/>
+          <w:bCs w:val="0"/>
+          <w:color w:val="C9D1D9"/>
+          <w:kern w:val="0"/>
+          <w:sz w:val="16"/>
+          <w:szCs w:val="16"/>
+          <w:shd w:val="clear" w:fill="121314"/>
+          <w:lang w:val="en-US" w:eastAsia="zh-CN" w:bidi="ar"/>
+          <w14:ligatures w14:val="standardContextual"/>
+        </w:rPr>
+        <w:t>Student</w:t>
+      </w:r>
+      <w:r>
+        <w:rPr>
+          <w:rFonts w:hint="default" w:ascii="Consolas" w:hAnsi="Consolas" w:eastAsia="Consolas" w:cs="Consolas"/>
+          <w:b w:val="0"/>
+          <w:bCs w:val="0"/>
+          <w:color w:val="BBBEBF"/>
+          <w:kern w:val="0"/>
+          <w:sz w:val="16"/>
+          <w:szCs w:val="16"/>
+          <w:shd w:val="clear" w:fill="121314"/>
+          <w:lang w:val="en-US" w:eastAsia="zh-CN" w:bidi="ar"/>
+          <w14:ligatures w14:val="standardContextual"/>
+        </w:rPr>
+        <w:t>.</w:t>
+      </w:r>
+      <w:r>
+        <w:rPr>
+          <w:rFonts w:hint="default" w:ascii="Consolas" w:hAnsi="Consolas" w:eastAsia="Consolas" w:cs="Consolas"/>
+          <w:b w:val="0"/>
+          <w:bCs w:val="0"/>
+          <w:color w:val="D2A8FF"/>
+          <w:kern w:val="0"/>
+          <w:sz w:val="16"/>
+          <w:szCs w:val="16"/>
+          <w:shd w:val="clear" w:fill="121314"/>
+          <w:lang w:val="en-US" w:eastAsia="zh-CN" w:bidi="ar"/>
+          <w14:ligatures w14:val="standardContextual"/>
+        </w:rPr>
+        <w:t>removeif</w:t>
+      </w:r>
+      <w:r>
+        <w:rPr>
+          <w:rFonts w:hint="default" w:ascii="Consolas" w:hAnsi="Consolas" w:eastAsia="Consolas" w:cs="Consolas"/>
+          <w:b w:val="0"/>
+          <w:bCs w:val="0"/>
+          <w:color w:val="BBBEBF"/>
+          <w:kern w:val="0"/>
+          <w:sz w:val="16"/>
+          <w:szCs w:val="16"/>
+          <w:shd w:val="clear" w:fill="121314"/>
+          <w:lang w:val="en-US" w:eastAsia="zh-CN" w:bidi="ar"/>
+          <w14:ligatures w14:val="standardContextual"/>
+        </w:rPr>
+        <w:t>(name -&gt; name.startwith(“F”));</w:t>
+      </w:r>
+    </w:p>
+    <w:p>
+      <w:pPr>
+        <w:pStyle w:val="29"/>
+        <w:numPr>
+          <w:ilvl w:val="0"/>
+          <w:numId w:val="0"/>
+        </w:numPr>
+        <w:rPr>
+          <w:rFonts w:hint="default"/>
+          <w:u w:val="none"/>
+          <w:lang w:val="en-US" w:eastAsia="zh-CN"/>
+        </w:rPr>
+      </w:pPr>
+    </w:p>
+    <w:p>
+      <w:pPr>
+        <w:pStyle w:val="29"/>
+        <w:numPr>
+          <w:ilvl w:val="0"/>
+          <w:numId w:val="0"/>
+        </w:numPr>
+        <w:rPr>
+          <w:rFonts w:hint="default"/>
+          <w:u w:val="none"/>
+          <w:lang w:val="en-US" w:eastAsia="zh-CN"/>
+        </w:rPr>
+      </w:pPr>
+      <w:r>
+        <w:rPr>
+          <w:rFonts w:hint="default"/>
+          <w:u w:val="none"/>
+          <w:lang w:val="en-US" w:eastAsia="zh-CN"/>
+        </w:rPr>
+        <w:t>Checking contents:</w:t>
+      </w:r>
+    </w:p>
+    <w:p>
+      <w:pPr>
+        <w:keepNext w:val="0"/>
+        <w:keepLines w:val="0"/>
+        <w:widowControl/>
+        <w:suppressLineNumbers w:val="0"/>
+        <w:shd w:val="clear" w:fill="121314"/>
+        <w:spacing w:line="228" w:lineRule="atLeast"/>
+        <w:jc w:val="left"/>
+        <w:rPr>
+          <w:rFonts w:hint="default" w:ascii="Consolas" w:hAnsi="Consolas" w:eastAsia="Consolas" w:cs="Consolas"/>
+          <w:b w:val="0"/>
+          <w:bCs w:val="0"/>
+          <w:color w:val="BBBEBF"/>
+          <w:sz w:val="16"/>
+          <w:szCs w:val="16"/>
+        </w:rPr>
+      </w:pPr>
+      <w:r>
+        <w:rPr>
+          <w:rFonts w:hint="default" w:ascii="Consolas" w:hAnsi="Consolas" w:eastAsia="Consolas" w:cs="Consolas"/>
+          <w:b w:val="0"/>
+          <w:bCs w:val="0"/>
+          <w:color w:val="BBBEBF"/>
+          <w:sz w:val="16"/>
+          <w:szCs w:val="16"/>
+          <w:lang w:val="en-US"/>
+        </w:rPr>
+        <w:t>Boolean hasAlice = student.contains(“Alice”); //true or false</w:t>
+      </w:r>
+    </w:p>
+    <w:p>
+      <w:pPr>
+        <w:pStyle w:val="29"/>
+        <w:numPr>
+          <w:ilvl w:val="0"/>
+          <w:numId w:val="0"/>
+        </w:numPr>
+        <w:rPr>
+          <w:rFonts w:hint="default"/>
+          <w:u w:val="none"/>
+          <w:lang w:val="en-US" w:eastAsia="zh-CN"/>
+        </w:rPr>
+      </w:pPr>
+    </w:p>
+    <w:p>
+      <w:pPr>
+        <w:pStyle w:val="29"/>
+        <w:numPr>
+          <w:ilvl w:val="0"/>
+          <w:numId w:val="0"/>
+        </w:numPr>
+        <w:rPr>
+          <w:rFonts w:hint="default"/>
+          <w:u w:val="none"/>
+          <w:lang w:val="en-US" w:eastAsia="zh-CN"/>
+        </w:rPr>
+      </w:pPr>
+      <w:r>
+        <w:rPr>
+          <w:rFonts w:hint="default"/>
+          <w:u w:val="none"/>
+          <w:lang w:val="en-US" w:eastAsia="zh-CN"/>
+        </w:rPr>
+        <w:t>To know index of any element:</w:t>
+      </w:r>
+    </w:p>
+    <w:p>
+      <w:pPr>
+        <w:keepNext w:val="0"/>
+        <w:keepLines w:val="0"/>
+        <w:widowControl/>
+        <w:suppressLineNumbers w:val="0"/>
+        <w:shd w:val="clear" w:fill="121314"/>
+        <w:spacing w:line="228" w:lineRule="atLeast"/>
+        <w:jc w:val="left"/>
+        <w:rPr>
+          <w:rFonts w:hint="default" w:ascii="Consolas" w:hAnsi="Consolas" w:eastAsia="Consolas" w:cs="Consolas"/>
+          <w:b w:val="0"/>
+          <w:bCs w:val="0"/>
+          <w:color w:val="BBBEBF"/>
+          <w:sz w:val="16"/>
+          <w:szCs w:val="16"/>
+          <w:lang w:val="en-US"/>
+        </w:rPr>
+      </w:pPr>
+      <w:r>
+        <w:rPr>
+          <w:rFonts w:hint="default" w:ascii="Consolas" w:hAnsi="Consolas" w:eastAsia="Consolas" w:cs="Consolas"/>
+          <w:b w:val="0"/>
+          <w:bCs w:val="0"/>
+          <w:color w:val="BBBEBF"/>
+          <w:sz w:val="16"/>
+          <w:szCs w:val="16"/>
+          <w:lang w:val="en-US"/>
+        </w:rPr>
+        <w:t>Int index = student.indexof(“carlie”);</w:t>
+      </w:r>
+    </w:p>
+    <w:p>
+      <w:pPr>
+        <w:pStyle w:val="29"/>
+        <w:numPr>
+          <w:ilvl w:val="0"/>
+          <w:numId w:val="0"/>
+        </w:numPr>
+        <w:rPr>
+          <w:rFonts w:hint="default"/>
+          <w:u w:val="none"/>
+          <w:lang w:val="en-US" w:eastAsia="zh-CN"/>
+        </w:rPr>
+      </w:pPr>
+    </w:p>
+    <w:p>
+      <w:pPr>
+        <w:pStyle w:val="29"/>
+        <w:numPr>
+          <w:ilvl w:val="0"/>
+          <w:numId w:val="0"/>
+        </w:numPr>
+        <w:rPr>
+          <w:rFonts w:hint="default"/>
+          <w:u w:val="none"/>
+          <w:lang w:val="en-US" w:eastAsia="zh-CN"/>
+        </w:rPr>
+      </w:pPr>
+    </w:p>
+    <w:p>
+      <w:pPr>
+        <w:pStyle w:val="29"/>
+        <w:numPr>
+          <w:ilvl w:val="0"/>
+          <w:numId w:val="0"/>
+        </w:numPr>
+        <w:rPr>
+          <w:rFonts w:hint="default"/>
+          <w:u w:val="none"/>
+          <w:lang w:val="en-US" w:eastAsia="zh-CN"/>
+        </w:rPr>
+      </w:pPr>
+    </w:p>
+    <w:p>
+      <w:pPr>
+        <w:pStyle w:val="29"/>
+        <w:numPr>
+          <w:ilvl w:val="0"/>
+          <w:numId w:val="0"/>
+        </w:numPr>
+        <w:rPr>
+          <w:rFonts w:hint="default"/>
+          <w:u w:val="none"/>
+          <w:lang w:val="en-US" w:eastAsia="zh-CN"/>
+        </w:rPr>
+      </w:pPr>
+      <w:r>
+        <w:rPr>
+          <w:rFonts w:hint="default"/>
+          <w:u w:val="none"/>
+          <w:lang w:val="en-US" w:eastAsia="zh-CN"/>
+        </w:rPr>
+        <w:t>Size and capacity:</w:t>
+      </w:r>
+    </w:p>
+    <w:p>
+      <w:pPr>
+        <w:keepNext w:val="0"/>
+        <w:keepLines w:val="0"/>
+        <w:widowControl/>
+        <w:suppressLineNumbers w:val="0"/>
+        <w:shd w:val="clear" w:fill="121314"/>
+        <w:spacing w:line="228" w:lineRule="atLeast"/>
+        <w:jc w:val="left"/>
+        <w:rPr>
+          <w:rFonts w:hint="default" w:ascii="Consolas" w:hAnsi="Consolas" w:eastAsia="Consolas" w:cs="Consolas"/>
+          <w:b w:val="0"/>
+          <w:bCs w:val="0"/>
+          <w:color w:val="BBBEBF"/>
+          <w:sz w:val="16"/>
+          <w:szCs w:val="16"/>
+          <w:lang w:val="en-US"/>
+        </w:rPr>
+      </w:pPr>
+      <w:r>
+        <w:rPr>
+          <w:rFonts w:hint="default" w:ascii="Consolas" w:hAnsi="Consolas" w:eastAsia="Consolas" w:cs="Consolas"/>
+          <w:b w:val="0"/>
+          <w:bCs w:val="0"/>
+          <w:color w:val="BBBEBF"/>
+          <w:sz w:val="16"/>
+          <w:szCs w:val="16"/>
+          <w:lang w:val="en-US"/>
+        </w:rPr>
+        <w:t>Students.size()</w:t>
+      </w:r>
+    </w:p>
+    <w:p>
+      <w:pPr>
+        <w:keepNext w:val="0"/>
+        <w:keepLines w:val="0"/>
+        <w:widowControl/>
+        <w:suppressLineNumbers w:val="0"/>
+        <w:shd w:val="clear" w:fill="121314"/>
+        <w:spacing w:line="228" w:lineRule="atLeast"/>
+        <w:jc w:val="left"/>
+        <w:rPr>
+          <w:rFonts w:hint="default" w:ascii="Consolas" w:hAnsi="Consolas" w:eastAsia="Consolas" w:cs="Consolas"/>
+          <w:b w:val="0"/>
+          <w:bCs w:val="0"/>
+          <w:color w:val="BBBEBF"/>
+          <w:sz w:val="16"/>
+          <w:szCs w:val="16"/>
+          <w:lang w:val="en-US"/>
+        </w:rPr>
+      </w:pPr>
+      <w:r>
+        <w:rPr>
+          <w:rFonts w:hint="default" w:ascii="Consolas" w:hAnsi="Consolas" w:eastAsia="Consolas" w:cs="Consolas"/>
+          <w:b w:val="0"/>
+          <w:bCs w:val="0"/>
+          <w:color w:val="BBBEBF"/>
+          <w:sz w:val="16"/>
+          <w:szCs w:val="16"/>
+          <w:lang w:val="en-US"/>
+        </w:rPr>
+        <w:t>Students.empty()</w:t>
+      </w:r>
+    </w:p>
+    <w:p>
+      <w:pPr>
+        <w:keepNext w:val="0"/>
+        <w:keepLines w:val="0"/>
+        <w:widowControl/>
+        <w:suppressLineNumbers w:val="0"/>
+        <w:shd w:val="clear" w:fill="121314"/>
+        <w:spacing w:line="228" w:lineRule="atLeast"/>
+        <w:jc w:val="left"/>
+        <w:rPr>
+          <w:rFonts w:hint="default" w:ascii="Consolas" w:hAnsi="Consolas" w:eastAsia="Consolas" w:cs="Consolas"/>
+          <w:b w:val="0"/>
+          <w:bCs w:val="0"/>
+          <w:color w:val="BBBEBF"/>
+          <w:sz w:val="16"/>
+          <w:szCs w:val="16"/>
+          <w:lang w:val="en-US"/>
+        </w:rPr>
+      </w:pPr>
+    </w:p>
+    <w:p>
+      <w:pPr>
+        <w:pStyle w:val="29"/>
+        <w:numPr>
+          <w:ilvl w:val="0"/>
+          <w:numId w:val="0"/>
+        </w:numPr>
+        <w:rPr>
+          <w:rFonts w:hint="default"/>
+          <w:u w:val="none"/>
+          <w:lang w:val="en-US" w:eastAsia="zh-CN"/>
+        </w:rPr>
+      </w:pPr>
+    </w:p>
+    <w:p>
+      <w:pPr>
+        <w:pStyle w:val="29"/>
+        <w:numPr>
+          <w:ilvl w:val="0"/>
+          <w:numId w:val="0"/>
+        </w:numPr>
+        <w:rPr>
+          <w:rFonts w:hint="default"/>
+          <w:u w:val="none"/>
+          <w:lang w:val="en-US" w:eastAsia="zh-CN"/>
+        </w:rPr>
+      </w:pPr>
+      <w:r>
+        <w:rPr>
+          <w:rFonts w:hint="default"/>
+          <w:u w:val="none"/>
+          <w:lang w:val="en-US" w:eastAsia="zh-CN"/>
+        </w:rPr>
+        <w:t>Iteration: - Multiple ways</w:t>
+      </w:r>
+    </w:p>
+    <w:p>
+      <w:pPr>
+        <w:keepNext w:val="0"/>
+        <w:keepLines w:val="0"/>
+        <w:widowControl/>
+        <w:suppressLineNumbers w:val="0"/>
+        <w:shd w:val="clear" w:fill="121314"/>
+        <w:spacing w:line="228" w:lineRule="atLeast"/>
+        <w:jc w:val="left"/>
+        <w:rPr>
+          <w:rFonts w:hint="default" w:ascii="Consolas" w:hAnsi="Consolas" w:eastAsia="Consolas" w:cs="Consolas"/>
+          <w:b w:val="0"/>
+          <w:bCs w:val="0"/>
+          <w:color w:val="C9D1D9"/>
+          <w:kern w:val="0"/>
+          <w:sz w:val="16"/>
+          <w:szCs w:val="16"/>
+          <w:shd w:val="clear" w:fill="121314"/>
+          <w:lang w:val="en-US" w:eastAsia="zh-CN" w:bidi="ar"/>
+          <w14:ligatures w14:val="standardContextual"/>
+        </w:rPr>
+      </w:pPr>
+      <w:r>
+        <w:rPr>
+          <w:rFonts w:hint="default" w:ascii="Consolas" w:hAnsi="Consolas" w:eastAsia="Consolas" w:cs="Consolas"/>
+          <w:b w:val="0"/>
+          <w:bCs w:val="0"/>
+          <w:color w:val="C9D1D9"/>
+          <w:kern w:val="0"/>
+          <w:sz w:val="16"/>
+          <w:szCs w:val="16"/>
+          <w:shd w:val="clear" w:fill="121314"/>
+          <w:lang w:val="en-US" w:eastAsia="zh-CN" w:bidi="ar"/>
+          <w14:ligatures w14:val="standardContextual"/>
+        </w:rPr>
+        <w:t>System.println(“for-each loop”)</w:t>
+      </w:r>
+    </w:p>
+    <w:p>
+      <w:pPr>
+        <w:keepNext w:val="0"/>
+        <w:keepLines w:val="0"/>
+        <w:widowControl/>
+        <w:suppressLineNumbers w:val="0"/>
+        <w:shd w:val="clear" w:fill="121314"/>
+        <w:spacing w:line="228" w:lineRule="atLeast"/>
+        <w:jc w:val="left"/>
+        <w:rPr>
+          <w:rFonts w:hint="default" w:ascii="Consolas" w:hAnsi="Consolas" w:eastAsia="Consolas" w:cs="Consolas"/>
+          <w:b w:val="0"/>
+          <w:bCs w:val="0"/>
+          <w:color w:val="C9D1D9"/>
+          <w:kern w:val="0"/>
+          <w:sz w:val="16"/>
+          <w:szCs w:val="16"/>
+          <w:shd w:val="clear" w:fill="121314"/>
+          <w:lang w:val="en-US" w:eastAsia="zh-CN" w:bidi="ar"/>
+          <w14:ligatures w14:val="standardContextual"/>
+        </w:rPr>
+      </w:pPr>
+      <w:r>
+        <w:rPr>
+          <w:rFonts w:hint="default" w:ascii="Consolas" w:hAnsi="Consolas" w:eastAsia="Consolas" w:cs="Consolas"/>
+          <w:b w:val="0"/>
+          <w:bCs w:val="0"/>
+          <w:color w:val="C9D1D9"/>
+          <w:kern w:val="0"/>
+          <w:sz w:val="16"/>
+          <w:szCs w:val="16"/>
+          <w:shd w:val="clear" w:fill="121314"/>
+          <w:lang w:val="en-US" w:eastAsia="zh-CN" w:bidi="ar"/>
+          <w14:ligatures w14:val="standardContextual"/>
+        </w:rPr>
+        <w:t>For(String student : students){</w:t>
+      </w:r>
+    </w:p>
+    <w:p>
+      <w:pPr>
+        <w:keepNext w:val="0"/>
+        <w:keepLines w:val="0"/>
+        <w:widowControl/>
+        <w:suppressLineNumbers w:val="0"/>
+        <w:shd w:val="clear" w:fill="121314"/>
+        <w:spacing w:line="228" w:lineRule="atLeast"/>
+        <w:ind w:firstLine="720" w:firstLineChars="0"/>
+        <w:jc w:val="left"/>
+        <w:rPr>
+          <w:rFonts w:hint="default" w:ascii="Consolas" w:hAnsi="Consolas" w:eastAsia="Consolas" w:cs="Consolas"/>
+          <w:b w:val="0"/>
+          <w:bCs w:val="0"/>
+          <w:color w:val="C9D1D9"/>
+          <w:kern w:val="0"/>
+          <w:sz w:val="16"/>
+          <w:szCs w:val="16"/>
+          <w:shd w:val="clear" w:fill="121314"/>
+          <w:lang w:val="en-US" w:eastAsia="zh-CN" w:bidi="ar"/>
+          <w14:ligatures w14:val="standardContextual"/>
+        </w:rPr>
+      </w:pPr>
+      <w:r>
+        <w:rPr>
+          <w:rFonts w:hint="default" w:ascii="Consolas" w:hAnsi="Consolas" w:eastAsia="Consolas" w:cs="Consolas"/>
+          <w:b w:val="0"/>
+          <w:bCs w:val="0"/>
+          <w:color w:val="C9D1D9"/>
+          <w:kern w:val="0"/>
+          <w:sz w:val="16"/>
+          <w:szCs w:val="16"/>
+          <w:shd w:val="clear" w:fill="121314"/>
+          <w:lang w:val="en-US" w:eastAsia="zh-CN" w:bidi="ar"/>
+          <w14:ligatures w14:val="standardContextual"/>
+        </w:rPr>
+        <w:t>System.out.println(“Student: ” + student);</w:t>
+      </w:r>
+    </w:p>
+    <w:p>
+      <w:pPr>
+        <w:keepNext w:val="0"/>
+        <w:keepLines w:val="0"/>
+        <w:widowControl/>
+        <w:suppressLineNumbers w:val="0"/>
+        <w:shd w:val="clear" w:fill="121314"/>
+        <w:spacing w:line="228" w:lineRule="atLeast"/>
+        <w:ind w:firstLine="720" w:firstLineChars="0"/>
+        <w:jc w:val="left"/>
+        <w:rPr>
+          <w:rFonts w:hint="default" w:ascii="Consolas" w:hAnsi="Consolas" w:eastAsia="Consolas" w:cs="Consolas"/>
+          <w:b w:val="0"/>
+          <w:bCs w:val="0"/>
+          <w:color w:val="C9D1D9"/>
+          <w:kern w:val="0"/>
+          <w:sz w:val="16"/>
+          <w:szCs w:val="16"/>
+          <w:shd w:val="clear" w:fill="121314"/>
+          <w:lang w:val="en-US" w:eastAsia="zh-CN" w:bidi="ar"/>
+          <w14:ligatures w14:val="standardContextual"/>
+        </w:rPr>
+      </w:pPr>
+      <w:r>
+        <w:rPr>
+          <w:rFonts w:hint="default" w:ascii="Consolas" w:hAnsi="Consolas" w:eastAsia="Consolas" w:cs="Consolas"/>
+          <w:b w:val="0"/>
+          <w:bCs w:val="0"/>
+          <w:color w:val="C9D1D9"/>
+          <w:kern w:val="0"/>
+          <w:sz w:val="16"/>
+          <w:szCs w:val="16"/>
+          <w:shd w:val="clear" w:fill="121314"/>
+          <w:lang w:val="en-US" w:eastAsia="zh-CN" w:bidi="ar"/>
+          <w14:ligatures w14:val="standardContextual"/>
+        </w:rPr>
+        <w:t>}</w:t>
+      </w:r>
+    </w:p>
+    <w:p>
+      <w:pPr>
+        <w:pStyle w:val="29"/>
+        <w:numPr>
+          <w:ilvl w:val="0"/>
+          <w:numId w:val="0"/>
+        </w:numPr>
+        <w:rPr>
+          <w:rFonts w:hint="default"/>
+          <w:u w:val="none"/>
+          <w:lang w:val="en-US" w:eastAsia="zh-CN"/>
+        </w:rPr>
+      </w:pPr>
+    </w:p>
+    <w:p>
+      <w:pPr>
+        <w:pStyle w:val="29"/>
+        <w:numPr>
+          <w:ilvl w:val="0"/>
+          <w:numId w:val="0"/>
+        </w:numPr>
+        <w:rPr>
+          <w:rFonts w:hint="default"/>
+          <w:u w:val="none"/>
+          <w:lang w:val="en-US" w:eastAsia="zh-CN"/>
+        </w:rPr>
+      </w:pPr>
+    </w:p>
+    <w:p>
+      <w:pPr>
+        <w:pStyle w:val="29"/>
+        <w:numPr>
+          <w:ilvl w:val="0"/>
+          <w:numId w:val="0"/>
+        </w:numPr>
+        <w:rPr>
+          <w:rFonts w:hint="default"/>
+          <w:u w:val="none"/>
+          <w:lang w:val="en-US" w:eastAsia="zh-CN"/>
+        </w:rPr>
+      </w:pPr>
+      <w:r>
+        <w:rPr>
+          <w:rFonts w:hint="default"/>
+          <w:u w:val="none"/>
+          <w:lang w:val="en-US" w:eastAsia="zh-CN"/>
+        </w:rPr>
+        <w:t>Iteration (Professional):</w:t>
+      </w:r>
+    </w:p>
+    <w:p>
+      <w:pPr>
+        <w:keepNext w:val="0"/>
+        <w:keepLines w:val="0"/>
+        <w:widowControl/>
+        <w:suppressLineNumbers w:val="0"/>
+        <w:shd w:val="clear" w:fill="121314"/>
+        <w:spacing w:line="228" w:lineRule="atLeast"/>
+        <w:jc w:val="left"/>
+        <w:rPr>
+          <w:rFonts w:hint="default" w:ascii="Consolas" w:hAnsi="Consolas" w:eastAsia="Consolas" w:cs="Consolas"/>
+          <w:b w:val="0"/>
+          <w:bCs w:val="0"/>
+          <w:color w:val="BBBEBF"/>
+          <w:sz w:val="16"/>
+          <w:szCs w:val="16"/>
+          <w:lang w:val="en-US"/>
+        </w:rPr>
+      </w:pPr>
+      <w:r>
+        <w:rPr>
+          <w:rFonts w:hint="default" w:ascii="Consolas" w:hAnsi="Consolas" w:eastAsia="Consolas" w:cs="Consolas"/>
+          <w:b w:val="0"/>
+          <w:bCs w:val="0"/>
+          <w:color w:val="BBBEBF"/>
+          <w:sz w:val="16"/>
+          <w:szCs w:val="16"/>
+          <w:lang w:val="en-US"/>
+        </w:rPr>
+        <w:t>Iterator&lt;string&gt; iteration = students.iterator();</w:t>
+      </w:r>
+    </w:p>
+    <w:p>
+      <w:pPr>
+        <w:keepNext w:val="0"/>
+        <w:keepLines w:val="0"/>
+        <w:widowControl/>
+        <w:suppressLineNumbers w:val="0"/>
+        <w:shd w:val="clear" w:fill="121314"/>
+        <w:spacing w:line="228" w:lineRule="atLeast"/>
+        <w:jc w:val="left"/>
+        <w:rPr>
+          <w:rFonts w:hint="default" w:ascii="Consolas" w:hAnsi="Consolas" w:eastAsia="Consolas" w:cs="Consolas"/>
+          <w:b w:val="0"/>
+          <w:bCs w:val="0"/>
+          <w:color w:val="BBBEBF"/>
+          <w:sz w:val="16"/>
+          <w:szCs w:val="16"/>
+          <w:lang w:val="en-US"/>
+        </w:rPr>
+      </w:pPr>
+      <w:r>
+        <w:rPr>
+          <w:rFonts w:hint="default" w:ascii="Consolas" w:hAnsi="Consolas" w:eastAsia="Consolas" w:cs="Consolas"/>
+          <w:b w:val="0"/>
+          <w:bCs w:val="0"/>
+          <w:color w:val="BBBEBF"/>
+          <w:sz w:val="16"/>
+          <w:szCs w:val="16"/>
+          <w:lang w:val="en-US"/>
+        </w:rPr>
+        <w:t>While (iteration.has.Next()){</w:t>
+      </w:r>
+    </w:p>
+    <w:p>
+      <w:pPr>
+        <w:keepNext w:val="0"/>
+        <w:keepLines w:val="0"/>
+        <w:widowControl/>
+        <w:suppressLineNumbers w:val="0"/>
+        <w:shd w:val="clear" w:fill="121314"/>
+        <w:spacing w:line="228" w:lineRule="atLeast"/>
+        <w:ind w:firstLine="720" w:firstLineChars="0"/>
+        <w:jc w:val="left"/>
+        <w:rPr>
+          <w:rFonts w:hint="default" w:ascii="Consolas" w:hAnsi="Consolas" w:eastAsia="Consolas" w:cs="Consolas"/>
+          <w:b w:val="0"/>
+          <w:bCs w:val="0"/>
+          <w:color w:val="BBBEBF"/>
+          <w:sz w:val="16"/>
+          <w:szCs w:val="16"/>
+          <w:lang w:val="en-US"/>
+        </w:rPr>
+      </w:pPr>
+      <w:r>
+        <w:rPr>
+          <w:rFonts w:hint="default" w:ascii="Consolas" w:hAnsi="Consolas" w:eastAsia="Consolas" w:cs="Consolas"/>
+          <w:b w:val="0"/>
+          <w:bCs w:val="0"/>
+          <w:color w:val="BBBEBF"/>
+          <w:sz w:val="16"/>
+          <w:szCs w:val="16"/>
+          <w:lang w:val="en-US"/>
+        </w:rPr>
+        <w:t>String student = iterator.next();</w:t>
+      </w:r>
+    </w:p>
+    <w:p>
+      <w:pPr>
+        <w:keepNext w:val="0"/>
+        <w:keepLines w:val="0"/>
+        <w:widowControl/>
+        <w:suppressLineNumbers w:val="0"/>
+        <w:shd w:val="clear" w:fill="121314"/>
+        <w:spacing w:line="228" w:lineRule="atLeast"/>
+        <w:ind w:firstLine="720" w:firstLineChars="0"/>
+        <w:jc w:val="left"/>
+        <w:rPr>
+          <w:rFonts w:hint="default" w:ascii="Consolas" w:hAnsi="Consolas" w:eastAsia="Consolas" w:cs="Consolas"/>
+          <w:b w:val="0"/>
+          <w:bCs w:val="0"/>
+          <w:color w:val="BBBEBF"/>
+          <w:sz w:val="16"/>
+          <w:szCs w:val="16"/>
+          <w:lang w:val="en-US"/>
+        </w:rPr>
+      </w:pPr>
+      <w:r>
+        <w:rPr>
+          <w:rFonts w:hint="default" w:ascii="Consolas" w:hAnsi="Consolas" w:eastAsia="Consolas" w:cs="Consolas"/>
+          <w:b w:val="0"/>
+          <w:bCs w:val="0"/>
+          <w:color w:val="BBBEBF"/>
+          <w:sz w:val="16"/>
+          <w:szCs w:val="16"/>
+          <w:lang w:val="en-US"/>
+        </w:rPr>
+        <w:t>}</w:t>
+      </w:r>
+    </w:p>
+    <w:p>
+      <w:pPr>
+        <w:pStyle w:val="29"/>
+        <w:numPr>
+          <w:ilvl w:val="0"/>
+          <w:numId w:val="0"/>
+        </w:numPr>
+        <w:rPr>
+          <w:rFonts w:hint="default"/>
+          <w:u w:val="none"/>
+          <w:lang w:val="en-US" w:eastAsia="zh-CN"/>
+        </w:rPr>
+      </w:pPr>
+    </w:p>
+    <w:p>
+      <w:pPr>
+        <w:pStyle w:val="29"/>
+        <w:numPr>
+          <w:ilvl w:val="0"/>
+          <w:numId w:val="0"/>
+        </w:numPr>
+        <w:rPr>
+          <w:rFonts w:hint="default"/>
+          <w:u w:val="none"/>
+          <w:lang w:val="en-US" w:eastAsia="zh-CN"/>
+        </w:rPr>
+      </w:pPr>
+      <w:r>
+        <w:rPr>
+          <w:rFonts w:hint="default"/>
+          <w:u w:val="none"/>
+          <w:lang w:val="en-US" w:eastAsia="zh-CN"/>
+        </w:rPr>
+        <w:t>Clearing the list:</w:t>
+      </w:r>
+    </w:p>
+    <w:p>
+      <w:pPr>
+        <w:keepNext w:val="0"/>
+        <w:keepLines w:val="0"/>
+        <w:widowControl/>
+        <w:suppressLineNumbers w:val="0"/>
+        <w:shd w:val="clear" w:fill="121314"/>
+        <w:spacing w:line="228" w:lineRule="atLeast"/>
+        <w:jc w:val="left"/>
+        <w:rPr>
+          <w:rFonts w:hint="default" w:ascii="Consolas" w:hAnsi="Consolas" w:eastAsia="Consolas" w:cs="Consolas"/>
+          <w:b w:val="0"/>
+          <w:bCs w:val="0"/>
+          <w:color w:val="BBBEBF"/>
+          <w:kern w:val="0"/>
+          <w:sz w:val="16"/>
+          <w:szCs w:val="16"/>
+          <w:shd w:val="clear" w:fill="121314"/>
+          <w:lang w:val="en-US" w:eastAsia="zh-CN" w:bidi="ar"/>
+          <w14:ligatures w14:val="standardContextual"/>
+        </w:rPr>
+      </w:pPr>
+      <w:r>
+        <w:rPr>
+          <w:rFonts w:hint="default" w:ascii="Consolas" w:hAnsi="Consolas" w:eastAsia="Consolas" w:cs="Consolas"/>
+          <w:b w:val="0"/>
+          <w:bCs w:val="0"/>
+          <w:color w:val="C9D1D9"/>
+          <w:kern w:val="0"/>
+          <w:sz w:val="16"/>
+          <w:szCs w:val="16"/>
+          <w:shd w:val="clear" w:fill="121314"/>
+          <w:lang w:val="en-US" w:eastAsia="zh-CN" w:bidi="ar"/>
+          <w14:ligatures w14:val="standardContextual"/>
+        </w:rPr>
+        <w:t>Students</w:t>
+      </w:r>
+      <w:r>
+        <w:rPr>
+          <w:rFonts w:hint="default" w:ascii="Consolas" w:hAnsi="Consolas" w:eastAsia="Consolas" w:cs="Consolas"/>
+          <w:b w:val="0"/>
+          <w:bCs w:val="0"/>
+          <w:color w:val="BBBEBF"/>
+          <w:kern w:val="0"/>
+          <w:sz w:val="16"/>
+          <w:szCs w:val="16"/>
+          <w:shd w:val="clear" w:fill="121314"/>
+          <w:lang w:val="en-US" w:eastAsia="zh-CN" w:bidi="ar"/>
+          <w14:ligatures w14:val="standardContextual"/>
+        </w:rPr>
+        <w:t>.</w:t>
+      </w:r>
+      <w:r>
+        <w:rPr>
+          <w:rFonts w:hint="default" w:ascii="Consolas" w:hAnsi="Consolas" w:eastAsia="Consolas" w:cs="Consolas"/>
+          <w:b w:val="0"/>
+          <w:bCs w:val="0"/>
+          <w:color w:val="D2A8FF"/>
+          <w:kern w:val="0"/>
+          <w:sz w:val="16"/>
+          <w:szCs w:val="16"/>
+          <w:shd w:val="clear" w:fill="121314"/>
+          <w:lang w:val="en-US" w:eastAsia="zh-CN" w:bidi="ar"/>
+          <w14:ligatures w14:val="standardContextual"/>
+        </w:rPr>
+        <w:t>clear</w:t>
+      </w:r>
+      <w:r>
+        <w:rPr>
+          <w:rFonts w:hint="default" w:ascii="Consolas" w:hAnsi="Consolas" w:eastAsia="Consolas" w:cs="Consolas"/>
+          <w:b w:val="0"/>
+          <w:bCs w:val="0"/>
+          <w:color w:val="BBBEBF"/>
+          <w:kern w:val="0"/>
+          <w:sz w:val="16"/>
+          <w:szCs w:val="16"/>
+          <w:shd w:val="clear" w:fill="121314"/>
+          <w:lang w:val="en-US" w:eastAsia="zh-CN" w:bidi="ar"/>
+          <w14:ligatures w14:val="standardContextual"/>
+        </w:rPr>
+        <w:t>();</w:t>
+      </w:r>
+    </w:p>
+    <w:p>
+      <w:pPr>
+        <w:keepNext w:val="0"/>
+        <w:keepLines w:val="0"/>
+        <w:widowControl/>
+        <w:suppressLineNumbers w:val="0"/>
+        <w:shd w:val="clear" w:fill="121314"/>
+        <w:spacing w:line="228" w:lineRule="atLeast"/>
+        <w:jc w:val="left"/>
+        <w:rPr>
+          <w:rFonts w:hint="default" w:ascii="Consolas" w:hAnsi="Consolas" w:eastAsia="Consolas" w:cs="Consolas"/>
+          <w:b w:val="0"/>
+          <w:bCs w:val="0"/>
+          <w:color w:val="BBBEBF"/>
+          <w:kern w:val="0"/>
+          <w:sz w:val="16"/>
+          <w:szCs w:val="16"/>
+          <w:shd w:val="clear" w:fill="121314"/>
+          <w:lang w:val="en-US" w:eastAsia="zh-CN" w:bidi="ar"/>
+          <w14:ligatures w14:val="standardContextual"/>
+        </w:rPr>
+      </w:pPr>
+      <w:r>
+        <w:rPr>
+          <w:rFonts w:hint="default" w:ascii="Consolas" w:hAnsi="Consolas" w:eastAsia="Consolas" w:cs="Consolas"/>
+          <w:b w:val="0"/>
+          <w:bCs w:val="0"/>
+          <w:color w:val="BBBEBF"/>
+          <w:kern w:val="0"/>
+          <w:sz w:val="16"/>
+          <w:szCs w:val="16"/>
+          <w:shd w:val="clear" w:fill="121314"/>
+          <w:lang w:val="en-US" w:eastAsia="zh-CN" w:bidi="ar"/>
+          <w14:ligatures w14:val="standardContextual"/>
+        </w:rPr>
+        <w:t>System.outprint(student.isEmpty());</w:t>
+      </w:r>
+    </w:p>
+    <w:p>
+      <w:pPr>
+        <w:pStyle w:val="29"/>
+        <w:numPr>
+          <w:ilvl w:val="0"/>
+          <w:numId w:val="0"/>
+        </w:numPr>
+        <w:rPr>
+          <w:rFonts w:hint="default"/>
+          <w:u w:val="none"/>
+          <w:lang w:val="en-US" w:eastAsia="zh-CN"/>
+        </w:rPr>
+      </w:pPr>
+    </w:p>
+    <w:p>
+      <w:pPr>
+        <w:pStyle w:val="29"/>
+        <w:numPr>
+          <w:ilvl w:val="0"/>
+          <w:numId w:val="0"/>
+        </w:numPr>
+        <w:rPr>
+          <w:rFonts w:hint="default"/>
+          <w:u w:val="none"/>
+          <w:lang w:val="en-US" w:eastAsia="zh-CN"/>
+        </w:rPr>
+      </w:pPr>
+      <w:r>
+        <w:rPr>
+          <w:rFonts w:hint="default"/>
+          <w:u w:val="none"/>
+          <w:lang w:val="en-US" w:eastAsia="zh-CN"/>
+        </w:rPr>
+        <w:t>Assignment:</w:t>
+      </w:r>
+    </w:p>
+    <w:p>
+      <w:pPr>
+        <w:pStyle w:val="29"/>
+        <w:numPr>
+          <w:ilvl w:val="0"/>
+          <w:numId w:val="0"/>
+        </w:numPr>
+        <w:rPr>
+          <w:rFonts w:hint="default"/>
+          <w:u w:val="none"/>
+          <w:lang w:val="en-US" w:eastAsia="zh-CN"/>
+        </w:rPr>
+      </w:pPr>
+      <w:r>
+        <w:rPr>
+          <w:rFonts w:hint="default"/>
+          <w:u w:val="none"/>
+          <w:lang w:val="en-US" w:eastAsia="zh-CN"/>
+        </w:rPr>
+        <w:t>Course registration system every course has a code and name and credits. This should be private no dircect access ussing encapsulation. Another class course registration to Add Course annd remove course and display all course and also fuction called find course and aqlso for total credit.</w:t>
+      </w:r>
       <w:bookmarkStart w:id="0" w:name="_GoBack"/>
       <w:bookmarkEnd w:id="0"/>
     </w:p>
@@ -4372,54 +7397,55 @@
       <w:pPr>
         <w:pStyle w:val="29"/>
         <w:numPr>
-          <w:numId w:val="0"/>
-        </w:numPr>
-        <w:rPr>
-          <w:rFonts w:hint="default"/>
-          <w:u w:val="none"/>
-          <w:lang w:val="en-IN"/>
-        </w:rPr>
-      </w:pPr>
-      <w:r>
-        <w:rPr>
-          <w:rFonts w:hint="default"/>
-          <w:u w:val="none"/>
-          <w:lang w:val="en-IN"/>
-        </w:rPr>
-        <w:t>Assignment : -examples of where exactly polymorphism used.</w:t>
-      </w:r>
-    </w:p>
-    <w:p>
-      <w:pPr>
-        <w:pStyle w:val="29"/>
-        <w:numPr>
-          <w:numId w:val="0"/>
-        </w:numPr>
-        <w:rPr>
-          <w:rFonts w:hint="default"/>
-          <w:u w:val="none"/>
-          <w:lang w:val="en-IN"/>
-        </w:rPr>
-      </w:pPr>
-      <w:r>
-        <w:rPr>
-          <w:rFonts w:hint="default"/>
-          <w:u w:val="none"/>
-          <w:lang w:val="en-IN"/>
-        </w:rPr>
-        <w:t>-Example program Method overloading and method overriding.</w:t>
-      </w:r>
-    </w:p>
-    <w:p>
-      <w:pPr>
-        <w:pStyle w:val="29"/>
-        <w:numPr>
-          <w:numId w:val="0"/>
-        </w:numPr>
-        <w:rPr>
-          <w:rFonts w:hint="default"/>
-          <w:u w:val="none"/>
-          <w:lang w:val="en-IN"/>
+          <w:ilvl w:val="0"/>
+          <w:numId w:val="0"/>
+        </w:numPr>
+        <w:rPr>
+          <w:rFonts w:hint="default"/>
+          <w:u w:val="none"/>
+          <w:lang w:val="en-US" w:eastAsia="zh-CN"/>
+        </w:rPr>
+      </w:pPr>
+    </w:p>
+    <w:p>
+      <w:pPr>
+        <w:pStyle w:val="29"/>
+        <w:numPr>
+          <w:ilvl w:val="0"/>
+          <w:numId w:val="0"/>
+        </w:numPr>
+        <w:rPr>
+          <w:rFonts w:hint="default"/>
+          <w:u w:val="none"/>
+          <w:lang w:val="en-US" w:eastAsia="zh-CN"/>
+        </w:rPr>
+      </w:pPr>
+    </w:p>
+    <w:p>
+      <w:pPr>
+        <w:pStyle w:val="29"/>
+        <w:numPr>
+          <w:ilvl w:val="0"/>
+          <w:numId w:val="0"/>
+        </w:numPr>
+        <w:rPr>
+          <w:rFonts w:hint="default"/>
+          <w:u w:val="none"/>
+          <w:lang w:val="en-US" w:eastAsia="zh-CN"/>
+        </w:rPr>
+      </w:pPr>
+    </w:p>
+    <w:p>
+      <w:pPr>
+        <w:pStyle w:val="29"/>
+        <w:numPr>
+          <w:ilvl w:val="0"/>
+          <w:numId w:val="0"/>
+        </w:numPr>
+        <w:rPr>
+          <w:rFonts w:hint="default"/>
+          <w:u w:val="none"/>
+          <w:lang w:val="en-US" w:eastAsia="zh-CN"/>
         </w:rPr>
       </w:pPr>
     </w:p>
@@ -4831,7 +7857,7 @@
   <w:docDefaults>
     <w:rPrDefault>
       <w:rPr>
-        <w:rFonts w:asciiTheme="minorHAnsi" w:hAnsiTheme="minorHAnsi" w:eastAsiaTheme="minorHAnsi" w:cstheme="minorBidi"/>
+        <w:rFonts w:ascii="Times New Roman" w:hAnsi="Times New Roman" w:eastAsia="SimSun" w:cs="Times New Roman"/>
       </w:rPr>
     </w:rPrDefault>
     <w:pPrDefault/>

</xml_diff>